<commit_message>
feat: implement phase 5 offline advisory analysis
</commit_message>
<xml_diff>
--- a/docs/cliente/GUIDA_CLIENTE.docx
+++ b/docs/cliente/GUIDA_CLIENTE.docx
@@ -15,12 +15,12 @@
         <w:pStyle w:val="Subtitle"/>
       </w:pPr>
       <w:r>
-        <w:t>Aggiornamento del 9 ottobre 2026 | Versione fase 4 | Ambiente locale di simulazione</w:t>
+        <w:t>Aggiornamento del 11 ottobre 2026 | Versione fase 5 | Ambiente locale di simulazione</w:t>
       </w:r>
     </w:p>
     <w:p>
       <w:r>
-        <w:t>TRD mette a disposizione un centro di controllo per consultare lo stato del sistema, preparare le configurazioni e scegliere le fonti Telegram. L’accesso e la gestione delle fonti sono utilizzabili nella dashboard. La raccolta dei messaggi richiede prima che il team colleghi un account Telegram. L’analisi tramite intelligenza artificiale e l’invio di ordini al broker non sono ancora attivi.</w:t>
+        <w:t>TRD mette a disposizione un centro di controllo per consultare lo stato del sistema, preparare le configurazioni e scegliere le fonti Telegram. È disponibile anche l’analisi consultiva con un simulatore locale: riconosce un formato preciso, registra gli esiti e spiega perché una proposta si ferma. La raccolta reale richiede prima che il team colleghi un account Telegram. I fornitori IA esterni e l’invio di ordini al broker restano disabilitati.</w:t>
       </w:r>
     </w:p>
     <w:p>
@@ -423,7 +423,7 @@
               <w:rPr>
                 <w:b w:val="0"/>
               </w:rPr>
-              <w:t>Agenti IA e broker</w:t>
+              <w:t>Analisi messaggi</w:t>
             </w:r>
           </w:p>
         </w:tc>
@@ -445,7 +445,105 @@
               <w:rPr>
                 <w:b w:val="0"/>
               </w:rPr>
-              <w:t>Inattivi; le pagine consentono di preparare o consultare le configurazioni</w:t>
+              <w:t>Classificazione locale, motivi di arresto e collegamento alle proposte; collaudata con dati di prova</w:t>
+            </w:r>
+          </w:p>
+        </w:tc>
+      </w:tr>
+      <w:tr>
+        <w:trPr>
+          <w:cantSplit/>
+        </w:trPr>
+        <w:tc>
+          <w:tcPr>
+            <w:tcW w:type="dxa" w:w="4762"/>
+            <w:tcMar>
+              <w:top w:w="95" w:type="dxa"/>
+              <w:left w:w="95" w:type="dxa"/>
+              <w:bottom w:w="95" w:type="dxa"/>
+              <w:right w:w="95" w:type="dxa"/>
+            </w:tcMar>
+          </w:tcPr>
+          <w:p>
+            <w:pPr>
+              <w:pStyle w:val="GuideTable"/>
+            </w:pPr>
+            <w:r>
+              <w:rPr>
+                <w:b w:val="0"/>
+              </w:rPr>
+              <w:t>Agenti IA</w:t>
+            </w:r>
+          </w:p>
+        </w:tc>
+        <w:tc>
+          <w:tcPr>
+            <w:tcW w:type="dxa" w:w="4762"/>
+            <w:tcMar>
+              <w:top w:w="95" w:type="dxa"/>
+              <w:left w:w="95" w:type="dxa"/>
+              <w:bottom w:w="95" w:type="dxa"/>
+              <w:right w:w="95" w:type="dxa"/>
+            </w:tcMar>
+          </w:tcPr>
+          <w:p>
+            <w:pPr>
+              <w:pStyle w:val="GuideTable"/>
+            </w:pPr>
+            <w:r>
+              <w:rPr>
+                <w:b w:val="0"/>
+              </w:rPr>
+              <w:t>Attivazione confermata del simulatore locale; configurazioni inizialmente disattivate</w:t>
+            </w:r>
+          </w:p>
+        </w:tc>
+      </w:tr>
+      <w:tr>
+        <w:trPr>
+          <w:cantSplit/>
+        </w:trPr>
+        <w:tc>
+          <w:tcPr>
+            <w:tcW w:type="dxa" w:w="4762"/>
+            <w:tcMar>
+              <w:top w:w="95" w:type="dxa"/>
+              <w:left w:w="95" w:type="dxa"/>
+              <w:bottom w:w="95" w:type="dxa"/>
+              <w:right w:w="95" w:type="dxa"/>
+            </w:tcMar>
+          </w:tcPr>
+          <w:p>
+            <w:pPr>
+              <w:pStyle w:val="GuideTable"/>
+            </w:pPr>
+            <w:r>
+              <w:rPr>
+                <w:b w:val="0"/>
+              </w:rPr>
+              <w:t>IA esterna e broker</w:t>
+            </w:r>
+          </w:p>
+        </w:tc>
+        <w:tc>
+          <w:tcPr>
+            <w:tcW w:type="dxa" w:w="4762"/>
+            <w:tcMar>
+              <w:top w:w="95" w:type="dxa"/>
+              <w:left w:w="95" w:type="dxa"/>
+              <w:bottom w:w="95" w:type="dxa"/>
+              <w:right w:w="95" w:type="dxa"/>
+            </w:tcMar>
+          </w:tcPr>
+          <w:p>
+            <w:pPr>
+              <w:pStyle w:val="GuideTable"/>
+            </w:pPr>
+            <w:r>
+              <w:rPr>
+                <w:b w:val="0"/>
+              </w:rPr>
+              <w:t>Disabilitati; richiedono le rispettive verifiche successive</w:t>
             </w:r>
           </w:p>
         </w:tc>
@@ -1054,7 +1152,40 @@
     </w:p>
     <w:p>
       <w:r>
-        <w:t>I messaggi sono dati da valutare. Oggi la raccolta non crea segnali di trading già interpretati, valutazioni IA o ordini al broker. La pagina Segnali riguarderà questi risultati quando saranno implementate le fasi successive.</w:t>
+        <w:t>I messaggi sono dati da valutare. La pagina Analisi messaggi mostra l’esito della classificazione e i motivi di arresto. Le proposte riconosciute compaiono anche in Segnali, con le versioni e le valutazioni consultive. Nessun messaggio o risultato del simulatore autorizza un ordine.</w:t>
+      </w:r>
+    </w:p>
+    <w:p>
+      <w:pPr>
+        <w:pStyle w:val="Heading1"/>
+      </w:pPr>
+      <w:r>
+        <w:t>Consultare e configurare l’analisi locale</w:t>
+      </w:r>
+    </w:p>
+    <w:p>
+      <w:r>
+        <w:t>In Analisi messaggi seleziona Aggiorna dati per leggere gli ultimi esiti. Ignorato indica che non è stato riconosciuto un segnale; Richiede revisione indica un formato ambiguo, una modifica, una risposta o una configurazione incompleta; Scaduto indica un messaggio troppo vecchio. In attesa indica una proposta consultiva che non dispone ancora di una verifica del rischio e di dati di mercato verificati.</w:t>
+      </w:r>
+    </w:p>
+    <w:p>
+      <w:r>
+        <w:t>Il riconoscimento iniziale richiede un solo strumento Forex supportato, direzione, prezzo di ingresso, stop loss e take profit. Il formato deve essere completo e preciso: intervalli di prezzo, più obiettivi, suffissi dello strumento o istruzioni aggiunte richiedono revisione. Il sistema non indovina prezzi o strumenti. La finestra iniziale dell’analisi è di quindici minuti dalla pubblicazione, distinta dal recupero della cronologia Telegram.</w:t>
+      </w:r>
+    </w:p>
+    <w:p>
+      <w:r>
+        <w:t>L’amministratore può aprire Agenti IA e attivare Analisi locale per Classificazione dei segnali, Interpretazione dei segnali, Analisi di mercato e Valutazione delle decisioni. Ogni attivazione passa da Rivedi modifica e Conferma e salva; il riepilogo mostra anche la nuova versione delle istruzioni. Gli agenti necessari devono essere tutti configurati. La Verifica critica può essere aggiunta, mentre la Revisione delle posizioni resta indisponibile. Il lettore può consultare le configurazioni senza modificarle.</w:t>
+      </w:r>
+    </w:p>
+    <w:p>
+      <w:r>
+        <w:t>Il simulatore restituisce attesa perché non osserva quotazioni o conti reali. Apri dettaglio permette di consultare prezzi della proposta, stato e tentativi degli agenti, con modello e versione. I costi del simulatore sono zero; la pagina Costi IA distingue consumi registrati e prenotazioni conservate quando un tentativo è rimasto senza esito confermato. Un riavvio non reinvia automaticamente una richiesta dall’esito sconosciuto.</w:t>
+      </w:r>
+    </w:p>
+    <w:p>
+      <w:r>
+        <w:t>Modifiche e cancellazioni conservano lo storico e fermano le proposte non inviate. Le risposte a un messaggio richiedono revisione: non producono una seconda proposta di apertura. Disattivare una fonte impedisce nuove elaborazioni autorizzate da quella fonte. Una configurazione modificata durante l’analisi richiede una nuova verifica.</w:t>
       </w:r>
     </w:p>
     <w:p>
@@ -1116,6 +1247,11 @@
         <w:t>9 ottobre 2026 — Prima guida cliente mantenuta nel progetto. Descrive accesso, configurazioni confermate, gestione delle fonti dalla dashboard e raccolta Telegram della fase 4. Il collegamento a un account reale è ancora da predisporre.</w:t>
       </w:r>
     </w:p>
+    <w:p>
+      <w:r>
+        <w:t>11 ottobre 2026 — Aggiunta l’analisi consultiva della fase 5: esiti dei messaggi, proposte, attivazione confermata del simulatore, revisione delle modifiche e visibilità dei tentativi e delle prenotazioni. IA esterna e trading restano disabilitati.</w:t>
+      </w:r>
+    </w:p>
     <w:sectPr>
       <w:headerReference w:type="default" r:id="rId9"/>
       <w:footerReference w:type="default" r:id="rId10"/>
@@ -1138,7 +1274,7 @@
       <w:rPr>
         <w:sz w:val="16"/>
       </w:rPr>
-      <w:t xml:space="preserve">Aggiornamento 9 ottobre 2026 · Pagina </w:t>
+      <w:t xml:space="preserve">Aggiornamento 11 ottobre 2026 · Pagina </w:t>
     </w:r>
     <w:fldSimple w:instr="PAGE"/>
   </w:p>

</xml_diff>

<commit_message>
feat(deploy): prepare Vercel environments and gated OpenRouter
</commit_message>
<xml_diff>
--- a/docs/cliente/GUIDA_CLIENTE.docx
+++ b/docs/cliente/GUIDA_CLIENTE.docx
@@ -15,12 +15,12 @@
         <w:pStyle w:val="Subtitle"/>
       </w:pPr>
       <w:r>
-        <w:t>Aggiornamento del 11 ottobre 2026 | Versione fase 5 | Ambiente locale di simulazione</w:t>
+        <w:t>Aggiornamento del 12 ottobre 2026 | Versione fase 5b | Simulazione e preparazione dell’accesso remoto</w:t>
       </w:r>
     </w:p>
     <w:p>
       <w:r>
-        <w:t>TRD mette a disposizione un centro di controllo per consultare lo stato del sistema, preparare le configurazioni e scegliere le fonti Telegram. È disponibile anche l’analisi consultiva con un simulatore locale: riconosce un formato preciso, registra gli esiti e spiega perché una proposta si ferma. La raccolta reale richiede prima che il team colleghi un account Telegram. I fornitori IA esterni e l’invio di ordini al broker restano disabilitati.</w:t>
+        <w:t>TRD mette a disposizione un centro di controllo per consultare lo stato del sistema, preparare le configurazioni e scegliere le fonti Telegram. L’analisi consultiva riconosce un formato preciso, registra gli esiti e spiega perché una proposta si ferma. Sono predisposti l’accesso remoto tramite Vercel e l’uso di OpenRouter, con controlli verificati su dati di prova. Il team deve ancora configurare e collaudare gli account reali. L’installazione attuale resta locale, con simulatore gratuito; la raccolta Telegram reale e l’invio di ordini restano disattivati.</w:t>
       </w:r>
     </w:p>
     <w:p>
@@ -201,6 +201,55 @@
                 <w:b w:val="0"/>
               </w:rPr>
               <w:t>Disponibile per amministratori e lettori</w:t>
+            </w:r>
+          </w:p>
+        </w:tc>
+      </w:tr>
+      <w:tr>
+        <w:trPr>
+          <w:cantSplit/>
+        </w:trPr>
+        <w:tc>
+          <w:tcPr>
+            <w:tcW w:type="dxa" w:w="4762"/>
+            <w:tcMar>
+              <w:top w:w="95" w:type="dxa"/>
+              <w:left w:w="95" w:type="dxa"/>
+              <w:bottom w:w="95" w:type="dxa"/>
+              <w:right w:w="95" w:type="dxa"/>
+            </w:tcMar>
+          </w:tcPr>
+          <w:p>
+            <w:pPr>
+              <w:pStyle w:val="GuideTable"/>
+            </w:pPr>
+            <w:r>
+              <w:rPr>
+                <w:b w:val="0"/>
+              </w:rPr>
+              <w:t>Tema chiaro e scuro</w:t>
+            </w:r>
+          </w:p>
+        </w:tc>
+        <w:tc>
+          <w:tcPr>
+            <w:tcW w:type="dxa" w:w="4762"/>
+            <w:tcMar>
+              <w:top w:w="95" w:type="dxa"/>
+              <w:left w:w="95" w:type="dxa"/>
+              <w:bottom w:w="95" w:type="dxa"/>
+              <w:right w:w="95" w:type="dxa"/>
+            </w:tcMar>
+          </w:tcPr>
+          <w:p>
+            <w:pPr>
+              <w:pStyle w:val="GuideTable"/>
+            </w:pPr>
+            <w:r>
+              <w:rPr>
+                <w:b w:val="0"/>
+              </w:rPr>
+              <w:t>Selezionabile anche nella pagina di accesso; preferenza conservata nel browser</w:t>
             </w:r>
           </w:p>
         </w:tc>
@@ -494,7 +543,7 @@
               <w:rPr>
                 <w:b w:val="0"/>
               </w:rPr>
-              <w:t>Attivazione confermata del simulatore locale; configurazioni inizialmente disattivate</w:t>
+              <w:t>Simulatore locale o modelli OpenRouter collaudati dal team; attivazione e costo massimo richiedono conferma</w:t>
             </w:r>
           </w:p>
         </w:tc>
@@ -521,7 +570,7 @@
               <w:rPr>
                 <w:b w:val="0"/>
               </w:rPr>
-              <w:t>IA esterna e broker</w:t>
+              <w:t>Accesso remoto</w:t>
             </w:r>
           </w:p>
         </w:tc>
@@ -543,7 +592,105 @@
               <w:rPr>
                 <w:b w:val="0"/>
               </w:rPr>
-              <w:t>Disabilitati; richiedono le rispettive verifiche successive</w:t>
+              <w:t>Predisposto con verifica dell’identità e MFA; il dominio cliente richiede ancora configurazione e collaudo</w:t>
+            </w:r>
+          </w:p>
+        </w:tc>
+      </w:tr>
+      <w:tr>
+        <w:trPr>
+          <w:cantSplit/>
+        </w:trPr>
+        <w:tc>
+          <w:tcPr>
+            <w:tcW w:type="dxa" w:w="4762"/>
+            <w:tcMar>
+              <w:top w:w="95" w:type="dxa"/>
+              <w:left w:w="95" w:type="dxa"/>
+              <w:bottom w:w="95" w:type="dxa"/>
+              <w:right w:w="95" w:type="dxa"/>
+            </w:tcMar>
+          </w:tcPr>
+          <w:p>
+            <w:pPr>
+              <w:pStyle w:val="GuideTable"/>
+            </w:pPr>
+            <w:r>
+              <w:rPr>
+                <w:b w:val="0"/>
+              </w:rPr>
+              <w:t>OpenRouter</w:t>
+            </w:r>
+          </w:p>
+        </w:tc>
+        <w:tc>
+          <w:tcPr>
+            <w:tcW w:type="dxa" w:w="4762"/>
+            <w:tcMar>
+              <w:top w:w="95" w:type="dxa"/>
+              <w:left w:w="95" w:type="dxa"/>
+              <w:bottom w:w="95" w:type="dxa"/>
+              <w:right w:w="95" w:type="dxa"/>
+            </w:tcMar>
+          </w:tcPr>
+          <w:p>
+            <w:pPr>
+              <w:pStyle w:val="GuideTable"/>
+            </w:pPr>
+            <w:r>
+              <w:rPr>
+                <w:b w:val="0"/>
+              </w:rPr>
+              <w:t>Integrato e verificato con dati di prova; disattivato finché mancano account e collaudo reale</w:t>
+            </w:r>
+          </w:p>
+        </w:tc>
+      </w:tr>
+      <w:tr>
+        <w:trPr>
+          <w:cantSplit/>
+        </w:trPr>
+        <w:tc>
+          <w:tcPr>
+            <w:tcW w:type="dxa" w:w="4762"/>
+            <w:tcMar>
+              <w:top w:w="95" w:type="dxa"/>
+              <w:left w:w="95" w:type="dxa"/>
+              <w:bottom w:w="95" w:type="dxa"/>
+              <w:right w:w="95" w:type="dxa"/>
+            </w:tcMar>
+          </w:tcPr>
+          <w:p>
+            <w:pPr>
+              <w:pStyle w:val="GuideTable"/>
+            </w:pPr>
+            <w:r>
+              <w:rPr>
+                <w:b w:val="0"/>
+              </w:rPr>
+              <w:t>Broker</w:t>
+            </w:r>
+          </w:p>
+        </w:tc>
+        <w:tc>
+          <w:tcPr>
+            <w:tcW w:type="dxa" w:w="4762"/>
+            <w:tcMar>
+              <w:top w:w="95" w:type="dxa"/>
+              <w:left w:w="95" w:type="dxa"/>
+              <w:bottom w:w="95" w:type="dxa"/>
+              <w:right w:w="95" w:type="dxa"/>
+            </w:tcMar>
+          </w:tcPr>
+          <w:p>
+            <w:pPr>
+              <w:pStyle w:val="GuideTable"/>
+            </w:pPr>
+            <w:r>
+              <w:rPr>
+                <w:b w:val="0"/>
+              </w:rPr>
+              <w:t>Disabilitato; motore di rischio ed esecuzione appartengono alle fasi successive</w:t>
             </w:r>
           </w:p>
         </w:tc>
@@ -575,6 +722,34 @@
     <w:p>
       <w:r>
         <w:t>La sessione termina dopo trenta minuti di inattività oppure, comunque, dopo otto ore dall’accesso. In caso di scadenza accedi nuovamente. Usa Esci quando hai finito, soprattutto su un dispositivo condiviso. Il ripristino della password e la gestione degli utenti richiedono attualmente l’intervento del team.</w:t>
+      </w:r>
+    </w:p>
+    <w:p>
+      <w:r>
+        <w:t>Quando il team consegnerà l’indirizzo remoto, apri esattamente il dominio protetto comunicato. Completa la verifica dell’identità e il secondo fattore, poi accedi a TRD con la stessa email autorizzata e la password personale. Un link di anteprima diverso dal dominio approvato non consente di leggere i dati. L’accesso remoto va consegnato soltanto dopo un collaudo reale della protezione.</w:t>
+      </w:r>
+    </w:p>
+    <w:p>
+      <w:r>
+        <w:t>Staging è l’ambiente di prova; produzione è quello destinato al cliente. I due ambienti hanno dati e account separati. La parola produzione indica l’ambiente di distribuzione e non significa trading reale: gli ordini restano disabilitati anche lì.</w:t>
+      </w:r>
+    </w:p>
+    <w:p>
+      <w:pPr>
+        <w:pStyle w:val="Heading1"/>
+      </w:pPr>
+      <w:r>
+        <w:t>Scegliere il tema della dashboard</w:t>
+      </w:r>
+    </w:p>
+    <w:p>
+      <w:r>
+        <w:t>La dashboard si apre inizialmente con il tema scuro. Usa Passa al tema chiaro nella parte superiore delle pagine; il pulsante diventa Passa al tema scuro per tornare alla modalità precedente. Il comando è disponibile anche sotto il modulo di accesso e sulle schermate mobili.</w:t>
+      </w:r>
+    </w:p>
+    <w:p>
+      <w:r>
+        <w:t>La scelta resta valida dopo un aggiornamento della pagina o un nuovo accesso dallo stesso browser, per un massimo di un anno. È una preferenza del browser, condivisa dagli utenti che lo utilizzano sullo stesso indirizzo; cancellare i cookie ripristina il tema scuro. Non occorrono configurazioni o account aggiuntivi.</w:t>
       </w:r>
     </w:p>
     <w:p>
@@ -1160,7 +1335,7 @@
         <w:pStyle w:val="Heading1"/>
       </w:pPr>
       <w:r>
-        <w:t>Consultare e configurare l’analisi locale</w:t>
+        <w:t>Consultare e configurare l’analisi</w:t>
       </w:r>
     </w:p>
     <w:p>
@@ -1175,12 +1350,27 @@
     </w:p>
     <w:p>
       <w:r>
-        <w:t>L’amministratore può aprire Agenti IA e attivare Analisi locale per Classificazione dei segnali, Interpretazione dei segnali, Analisi di mercato e Valutazione delle decisioni. Ogni attivazione passa da Rivedi modifica e Conferma e salva; il riepilogo mostra anche la nuova versione delle istruzioni. Gli agenti necessari devono essere tutti configurati. La Verifica critica può essere aggiunta, mentre la Revisione delle posizioni resta indisponibile. Il lettore può consultare le configurazioni senza modificarle.</w:t>
+        <w:t>L’amministratore può aprire Agenti IA e attivare Agente attivo per Classificazione dei segnali, Interpretazione dei segnali, Analisi di mercato e Valutazione delle decisioni. Ogni attivazione passa da Rivedi modifica e Conferma e salva; il riepilogo mostra anche la nuova versione delle istruzioni. Gli agenti necessari devono essere tutti configurati. La Verifica critica può essere aggiunta, mentre la Revisione delle posizioni resta indisponibile. Il lettore può consultare le configurazioni senza modificarle.</w:t>
       </w:r>
     </w:p>
     <w:p>
       <w:r>
         <w:t>Il simulatore restituisce attesa perché non osserva quotazioni o conti reali. Apri dettaglio permette di consultare prezzi della proposta, stato e tentativi degli agenti, con modello e versione. I costi del simulatore sono zero; la pagina Costi IA distingue consumi registrati e prenotazioni conservate quando un tentativo è rimasto senza esito confermato. Un riavvio non reinvia automaticamente una richiesta dall’esito sconosciuto.</w:t>
+      </w:r>
+    </w:p>
+    <w:p>
+      <w:r>
+        <w:t>Dopo il collaudo del team, i modelli OpenRouter approvati compaiono per Analisi di mercato, Valutazione delle decisioni e Verifica critica, insieme al fornitore e alla scadenza dell’approvazione. Per usarli occorre un costo massimo positivo per richiesta, entro i budget autorizzati dal team. Il simulatore richiede invece costo massimo zero. Classificazione e interpretazione restano locali. La dashboard non richiede chiavi API, credenziali del server o del broker.</w:t>
+      </w:r>
+    </w:p>
+    <w:p>
+      <w:r>
+        <w:t>I modelli esterni possono generare addebiti. Costi IA mostra separatamente l’importo contabilizzato e il costo confermato dal fornitore. La prenotazione iniziale è prudente e può essere superiore al consumo finale. Se il costo non è confermato, il sistema conserva la prenotazione e ferma ulteriori tentativi; chiedi al team la riconciliazione. Se scade l’approvazione del modello, è necessaria una nuova verifica del team.</w:t>
+      </w:r>
+    </w:p>
+    <w:p>
+      <w:r>
+        <w:t>La proposta normalizzata può essere inviata al fornitore approvato; il testo Telegram completo non viene inviato. Il team deve verificare anche le condizioni di trattamento dei dati dell’account. L’analisi non dispone ancora di dati di mercato verificati e non autorizza ordini, anche quando un modello restituisce una proposta positiva.</w:t>
       </w:r>
     </w:p>
     <w:p>
@@ -1235,6 +1425,11 @@
       </w:r>
     </w:p>
     <w:p>
+      <w:r>
+        <w:t>Prima dell’accesso remoto servono dominio, verifica MFA e prove dei ruoli; prima di OpenRouter servono credito, modello approvato, limiti di spesa e collaudo reale della fatturazione. Il superamento dei test locali non sostituisce queste configurazioni.</w:t>
+      </w:r>
+    </w:p>
+    <w:p>
       <w:pPr>
         <w:pStyle w:val="Heading1"/>
       </w:pPr>
@@ -1252,6 +1447,16 @@
         <w:t>11 ottobre 2026 — Aggiunta l’analisi consultiva della fase 5: esiti dei messaggi, proposte, attivazione confermata del simulatore, revisione delle modifiche e visibilità dei tentativi e delle prenotazioni. IA esterna e trading restano disabilitati.</w:t>
       </w:r>
     </w:p>
+    <w:p>
+      <w:r>
+        <w:t>12 ottobre 2026 — Predisposti Vercel, accesso remoto con MFA e ambienti separati; integrato OpenRouter con modelli collaudati, scadenza e costo massimo confermato. Distinti i test con dati di prova dal collaudo degli account reali ancora richiesto. La fase 6 e gli ordini restano da implementare.</w:t>
+      </w:r>
+    </w:p>
+    <w:p>
+      <w:r>
+        <w:t>12 ottobre 2026 — Aggiunto e verificato il cambio fra tema chiaro e scuro, disponibile anche all’accesso e su mobile, con preferenza conservata nel browser.</w:t>
+      </w:r>
+    </w:p>
     <w:sectPr>
       <w:headerReference w:type="default" r:id="rId9"/>
       <w:footerReference w:type="default" r:id="rId10"/>
@@ -1274,7 +1479,7 @@
       <w:rPr>
         <w:sz w:val="16"/>
       </w:rPr>
-      <w:t xml:space="preserve">Aggiornamento 11 ottobre 2026 · Pagina </w:t>
+      <w:t xml:space="preserve">Aggiornamento 12 ottobre 2026 · Pagina </w:t>
     </w:r>
     <w:fldSimple w:instr="PAGE"/>
   </w:p>

</xml_diff>

<commit_message>
docs: align phase 6 evidence and verified Italian guides
</commit_message>
<xml_diff>
--- a/docs/cliente/GUIDA_CLIENTE.docx
+++ b/docs/cliente/GUIDA_CLIENTE.docx
@@ -7,7 +7,7 @@
         <w:pStyle w:val="Title"/>
       </w:pPr>
       <w:r>
-        <w:t>TRD Guida operativa per il cliente</w:t>
+        <w:t>TRD Guida cliente</w:t>
       </w:r>
     </w:p>
     <w:p>
@@ -15,17 +15,21 @@
         <w:pStyle w:val="Subtitle"/>
       </w:pPr>
       <w:r>
-        <w:t>Aggiornamento del 12 ottobre 2026 | Versione fase 5b | Simulazione e preparazione dell’accesso remoto</w:t>
+        <w:t>Aggiornamento del 12 ottobre 2026 | Fase 6 | Analisi consultiva e rischio locale</w:t>
       </w:r>
     </w:p>
     <w:p>
       <w:r>
-        <w:t>TRD mette a disposizione un centro di controllo per consultare lo stato del sistema, preparare le configurazioni e scegliere le fonti Telegram. L’analisi consultiva riconosce un formato preciso, registra gli esiti e spiega perché una proposta si ferma. Sono predisposti l’accesso remoto tramite Vercel e l’uso di OpenRouter, con controlli verificati su dati di prova. Il team deve ancora configurare e collaudare gli account reali. L’installazione attuale resta locale, con simulatore gratuito; la raccolta Telegram reale e l’invio di ordini restano disattivati.</w:t>
+        <w:t xml:space="preserve">TRD raccoglie messaggi da fonti Telegram autorizzate, riconosce segnali strutturati e mostra analisi e motivi di arresto nella dashboard. </w:t>
       </w:r>
-    </w:p>
-    <w:p>
       <w:r>
-        <w:t>Questa guida descrive l’utilizzo disponibile oggi, i controlli da verificare e le azioni da richiedere al team in caso di problemi. Viene aggiornata insieme alle funzionalità del prodotto.</w:t>
+        <w:rPr>
+          <w:b/>
+        </w:rPr>
+        <w:t>Oggi non invia ordini al broker.</w:t>
+      </w:r>
+      <w:r>
+        <w:t xml:space="preserve"> L’installazione resta locale, con simulatore gratuito, raccolta Telegram e agenti disattivati finché non vengono configurati.</w:t>
       </w:r>
     </w:p>
     <w:p>
@@ -33,7 +37,71 @@
         <w:pStyle w:val="Heading1"/>
       </w:pPr>
       <w:r>
-        <w:t>Funzionalità disponibili</w:t>
+        <w:t>Il percorso di un segnale</w:t>
+      </w:r>
+    </w:p>
+    <w:p>
+      <w:pPr>
+        <w:spacing w:after="160"/>
+        <w:jc w:val="center"/>
+      </w:pPr>
+      <w:r>
+        <w:drawing>
+          <wp:inline xmlns:a="http://schemas.openxmlformats.org/drawingml/2006/main" xmlns:pic="http://schemas.openxmlformats.org/drawingml/2006/picture">
+            <wp:extent cx="6048000" cy="3075030"/>
+            <wp:docPr id="1" name="Picture 1" descr="Flusso da Telegram alla dashboard con controlli e arresto prima degli ordini"/>
+            <wp:cNvGraphicFramePr>
+              <a:graphicFrameLocks noChangeAspect="1"/>
+            </wp:cNvGraphicFramePr>
+            <a:graphic>
+              <a:graphicData uri="http://schemas.openxmlformats.org/drawingml/2006/picture">
+                <pic:pic>
+                  <pic:nvPicPr>
+                    <pic:cNvPr id="0" name="flusso-segnale.png"/>
+                    <pic:cNvPicPr/>
+                  </pic:nvPicPr>
+                  <pic:blipFill>
+                    <a:blip r:embed="rId11"/>
+                    <a:stretch>
+                      <a:fillRect/>
+                    </a:stretch>
+                  </pic:blipFill>
+                  <pic:spPr>
+                    <a:xfrm>
+                      <a:off x="0" y="0"/>
+                      <a:ext cx="6048000" cy="3075030"/>
+                    </a:xfrm>
+                    <a:prstGeom prst="rect"/>
+                  </pic:spPr>
+                </pic:pic>
+              </a:graphicData>
+            </a:graphic>
+          </wp:inline>
+        </w:drawing>
+      </w:r>
+    </w:p>
+    <w:p>
+      <w:r>
+        <w:t xml:space="preserve">Apri il </w:t>
+      </w:r>
+      <w:hyperlink r:id="rId12">
+        <w:r>
+          <w:rPr>
+            <w:rStyle w:val="Hyperlink"/>
+          </w:rPr>
+          <w:t>diagramma interattivo</w:t>
+        </w:r>
+      </w:hyperlink>
+      <w:r>
+        <w:t xml:space="preserve"> nel browser per esplorare ogni passaggio. Funziona anche senza connessione.</w:t>
+      </w:r>
+    </w:p>
+    <w:p>
+      <w:pPr>
+        <w:pStyle w:val="Heading1"/>
+      </w:pPr>
+      <w:r>
+        <w:t>Cosa è disponibile oggi</w:t>
       </w:r>
     </w:p>
     <w:tbl>
@@ -52,8 +120,8 @@
         </w:tblBorders>
       </w:tblPr>
       <w:tblGrid>
-        <w:gridCol w:w="4762"/>
-        <w:gridCol w:w="4762"/>
+        <w:gridCol w:w="4309"/>
+        <w:gridCol w:w="5216"/>
       </w:tblGrid>
       <w:tr>
         <w:trPr>
@@ -62,14 +130,15 @@
         </w:trPr>
         <w:tc>
           <w:tcPr>
-            <w:tcW w:type="dxa" w:w="4762"/>
+            <w:tcW w:type="dxa" w:w="4309"/>
+            <w:vAlign w:val="center"/>
             <w:tcMar>
               <w:top w:w="95" w:type="dxa"/>
               <w:left w:w="95" w:type="dxa"/>
               <w:bottom w:w="95" w:type="dxa"/>
               <w:right w:w="95" w:type="dxa"/>
             </w:tcMar>
-            <w:shd w:fill="F2F2F2"/>
+            <w:shd w:fill="DFEAF3"/>
           </w:tcPr>
           <w:p>
             <w:pPr>
@@ -85,14 +154,15 @@
         </w:tc>
         <w:tc>
           <w:tcPr>
-            <w:tcW w:type="dxa" w:w="4762"/>
+            <w:tcW w:type="dxa" w:w="5216"/>
+            <w:vAlign w:val="center"/>
             <w:tcMar>
               <w:top w:w="95" w:type="dxa"/>
               <w:left w:w="95" w:type="dxa"/>
               <w:bottom w:w="95" w:type="dxa"/>
               <w:right w:w="95" w:type="dxa"/>
             </w:tcMar>
-            <w:shd w:fill="F2F2F2"/>
+            <w:shd w:fill="DFEAF3"/>
           </w:tcPr>
           <w:p>
             <w:pPr>
@@ -102,7 +172,7 @@
               <w:rPr>
                 <w:b/>
               </w:rPr>
-              <w:t>Disponibilità attuale</w:t>
+              <w:t>Stato e limite</w:t>
             </w:r>
           </w:p>
         </w:tc>
@@ -113,7 +183,8 @@
         </w:trPr>
         <w:tc>
           <w:tcPr>
-            <w:tcW w:type="dxa" w:w="4762"/>
+            <w:tcW w:type="dxa" w:w="4309"/>
+            <w:vAlign w:val="center"/>
             <w:tcMar>
               <w:top w:w="95" w:type="dxa"/>
               <w:left w:w="95" w:type="dxa"/>
@@ -129,13 +200,14 @@
               <w:rPr>
                 <w:b w:val="0"/>
               </w:rPr>
-              <w:t>Accesso e uscita</w:t>
+              <w:t>Dashboard e utenti</w:t>
             </w:r>
           </w:p>
         </w:tc>
         <w:tc>
           <w:tcPr>
-            <w:tcW w:type="dxa" w:w="4762"/>
+            <w:tcW w:type="dxa" w:w="5216"/>
+            <w:vAlign w:val="center"/>
             <w:tcMar>
               <w:top w:w="95" w:type="dxa"/>
               <w:left w:w="95" w:type="dxa"/>
@@ -151,7 +223,7 @@
               <w:rPr>
                 <w:b w:val="0"/>
               </w:rPr>
-              <w:t>Disponibili con utenti autorizzati e ruoli distinti</w:t>
+              <w:t>Implementati e verificati in locale; amministratore modifica, lettore consulta</w:t>
             </w:r>
           </w:p>
         </w:tc>
@@ -162,7 +234,61 @@
         </w:trPr>
         <w:tc>
           <w:tcPr>
-            <w:tcW w:type="dxa" w:w="4762"/>
+            <w:tcW w:type="dxa" w:w="4309"/>
+            <w:vAlign w:val="center"/>
+            <w:tcMar>
+              <w:top w:w="95" w:type="dxa"/>
+              <w:left w:w="95" w:type="dxa"/>
+              <w:bottom w:w="95" w:type="dxa"/>
+              <w:right w:w="95" w:type="dxa"/>
+            </w:tcMar>
+            <w:shd w:fill="F5F8FA"/>
+          </w:tcPr>
+          <w:p>
+            <w:pPr>
+              <w:pStyle w:val="GuideTable"/>
+            </w:pPr>
+            <w:r>
+              <w:rPr>
+                <w:b w:val="0"/>
+              </w:rPr>
+              <w:t>Fonti e messaggi Telegram</w:t>
+            </w:r>
+          </w:p>
+        </w:tc>
+        <w:tc>
+          <w:tcPr>
+            <w:tcW w:type="dxa" w:w="5216"/>
+            <w:vAlign w:val="center"/>
+            <w:tcMar>
+              <w:top w:w="95" w:type="dxa"/>
+              <w:left w:w="95" w:type="dxa"/>
+              <w:bottom w:w="95" w:type="dxa"/>
+              <w:right w:w="95" w:type="dxa"/>
+            </w:tcMar>
+            <w:shd w:fill="F5F8FA"/>
+          </w:tcPr>
+          <w:p>
+            <w:pPr>
+              <w:pStyle w:val="GuideTable"/>
+            </w:pPr>
+            <w:r>
+              <w:rPr>
+                <w:b w:val="0"/>
+              </w:rPr>
+              <w:t>Implementati e verificati con dati di prova; account reale da collegare e collaudare</w:t>
+            </w:r>
+          </w:p>
+        </w:tc>
+      </w:tr>
+      <w:tr>
+        <w:trPr>
+          <w:cantSplit/>
+        </w:trPr>
+        <w:tc>
+          <w:tcPr>
+            <w:tcW w:type="dxa" w:w="4309"/>
+            <w:vAlign w:val="center"/>
             <w:tcMar>
               <w:top w:w="95" w:type="dxa"/>
               <w:left w:w="95" w:type="dxa"/>
@@ -178,13 +304,14 @@
               <w:rPr>
                 <w:b w:val="0"/>
               </w:rPr>
-              <w:t>Consultazione delle pagine</w:t>
+              <w:t>Classificazione e interpretazione</w:t>
             </w:r>
           </w:p>
         </w:tc>
         <w:tc>
           <w:tcPr>
-            <w:tcW w:type="dxa" w:w="4762"/>
+            <w:tcW w:type="dxa" w:w="5216"/>
+            <w:vAlign w:val="center"/>
             <w:tcMar>
               <w:top w:w="95" w:type="dxa"/>
               <w:left w:w="95" w:type="dxa"/>
@@ -200,7 +327,7 @@
               <w:rPr>
                 <w:b w:val="0"/>
               </w:rPr>
-              <w:t>Disponibile per amministratori e lettori</w:t>
+              <w:t>Locali, con formato rigoroso; attivazione esplicita degli agenti</w:t>
             </w:r>
           </w:p>
         </w:tc>
@@ -211,7 +338,61 @@
         </w:trPr>
         <w:tc>
           <w:tcPr>
-            <w:tcW w:type="dxa" w:w="4762"/>
+            <w:tcW w:type="dxa" w:w="4309"/>
+            <w:vAlign w:val="center"/>
+            <w:tcMar>
+              <w:top w:w="95" w:type="dxa"/>
+              <w:left w:w="95" w:type="dxa"/>
+              <w:bottom w:w="95" w:type="dxa"/>
+              <w:right w:w="95" w:type="dxa"/>
+            </w:tcMar>
+            <w:shd w:fill="F5F8FA"/>
+          </w:tcPr>
+          <w:p>
+            <w:pPr>
+              <w:pStyle w:val="GuideTable"/>
+            </w:pPr>
+            <w:r>
+              <w:rPr>
+                <w:b w:val="0"/>
+              </w:rPr>
+              <w:t>Analisi e decisione IA</w:t>
+            </w:r>
+          </w:p>
+        </w:tc>
+        <w:tc>
+          <w:tcPr>
+            <w:tcW w:type="dxa" w:w="5216"/>
+            <w:vAlign w:val="center"/>
+            <w:tcMar>
+              <w:top w:w="95" w:type="dxa"/>
+              <w:left w:w="95" w:type="dxa"/>
+              <w:bottom w:w="95" w:type="dxa"/>
+              <w:right w:w="95" w:type="dxa"/>
+            </w:tcMar>
+            <w:shd w:fill="F5F8FA"/>
+          </w:tcPr>
+          <w:p>
+            <w:pPr>
+              <w:pStyle w:val="GuideTable"/>
+            </w:pPr>
+            <w:r>
+              <w:rPr>
+                <w:b w:val="0"/>
+              </w:rPr>
+              <w:t>Consultive; simulatore disponibile, senza dati di mercato verificati</w:t>
+            </w:r>
+          </w:p>
+        </w:tc>
+      </w:tr>
+      <w:tr>
+        <w:trPr>
+          <w:cantSplit/>
+        </w:trPr>
+        <w:tc>
+          <w:tcPr>
+            <w:tcW w:type="dxa" w:w="4309"/>
+            <w:vAlign w:val="center"/>
             <w:tcMar>
               <w:top w:w="95" w:type="dxa"/>
               <w:left w:w="95" w:type="dxa"/>
@@ -227,13 +408,14 @@
               <w:rPr>
                 <w:b w:val="0"/>
               </w:rPr>
-              <w:t>Tema chiaro e scuro</w:t>
+              <w:t>OpenRouter e accesso remoto</w:t>
             </w:r>
           </w:p>
         </w:tc>
         <w:tc>
           <w:tcPr>
-            <w:tcW w:type="dxa" w:w="4762"/>
+            <w:tcW w:type="dxa" w:w="5216"/>
+            <w:vAlign w:val="center"/>
             <w:tcMar>
               <w:top w:w="95" w:type="dxa"/>
               <w:left w:w="95" w:type="dxa"/>
@@ -249,7 +431,7 @@
               <w:rPr>
                 <w:b w:val="0"/>
               </w:rPr>
-              <w:t>Selezionabile anche nella pagina di accesso; preferenza conservata nel browser</w:t>
+              <w:t>Implementati e verificati con dati di prova; account, dominio, MFA e collaudo reale ancora richiesti</w:t>
             </w:r>
           </w:p>
         </w:tc>
@@ -260,7 +442,61 @@
         </w:trPr>
         <w:tc>
           <w:tcPr>
-            <w:tcW w:type="dxa" w:w="4762"/>
+            <w:tcW w:type="dxa" w:w="4309"/>
+            <w:vAlign w:val="center"/>
+            <w:tcMar>
+              <w:top w:w="95" w:type="dxa"/>
+              <w:left w:w="95" w:type="dxa"/>
+              <w:bottom w:w="95" w:type="dxa"/>
+              <w:right w:w="95" w:type="dxa"/>
+            </w:tcMar>
+            <w:shd w:fill="F5F8FA"/>
+          </w:tcPr>
+          <w:p>
+            <w:pPr>
+              <w:pStyle w:val="GuideTable"/>
+            </w:pPr>
+            <w:r>
+              <w:rPr>
+                <w:b w:val="0"/>
+              </w:rPr>
+              <w:t>Motore del rischio</w:t>
+            </w:r>
+          </w:p>
+        </w:tc>
+        <w:tc>
+          <w:tcPr>
+            <w:tcW w:type="dxa" w:w="5216"/>
+            <w:vAlign w:val="center"/>
+            <w:tcMar>
+              <w:top w:w="95" w:type="dxa"/>
+              <w:left w:w="95" w:type="dxa"/>
+              <w:bottom w:w="95" w:type="dxa"/>
+              <w:right w:w="95" w:type="dxa"/>
+            </w:tcMar>
+            <w:shd w:fill="F5F8FA"/>
+          </w:tcPr>
+          <w:p>
+            <w:pPr>
+              <w:pStyle w:val="GuideTable"/>
+            </w:pPr>
+            <w:r>
+              <w:rPr>
+                <w:b w:val="0"/>
+              </w:rPr>
+              <w:t>Implementato e verificato con dati di prova; non ancora collegato ai segnali e al conto</w:t>
+            </w:r>
+          </w:p>
+        </w:tc>
+      </w:tr>
+      <w:tr>
+        <w:trPr>
+          <w:cantSplit/>
+        </w:trPr>
+        <w:tc>
+          <w:tcPr>
+            <w:tcW w:type="dxa" w:w="4309"/>
+            <w:vAlign w:val="center"/>
             <w:tcMar>
               <w:top w:w="95" w:type="dxa"/>
               <w:left w:w="95" w:type="dxa"/>
@@ -276,13 +512,14 @@
               <w:rPr>
                 <w:b w:val="0"/>
               </w:rPr>
-              <w:t>Fonti Telegram</w:t>
+              <w:t>Esecuzione, MT5 e ordini</w:t>
             </w:r>
           </w:p>
         </w:tc>
         <w:tc>
           <w:tcPr>
-            <w:tcW w:type="dxa" w:w="4762"/>
+            <w:tcW w:type="dxa" w:w="5216"/>
+            <w:vAlign w:val="center"/>
             <w:tcMar>
               <w:top w:w="95" w:type="dxa"/>
               <w:left w:w="95" w:type="dxa"/>
@@ -298,399 +535,7 @@
               <w:rPr>
                 <w:b w:val="0"/>
               </w:rPr>
-              <w:t>Inserimento, rinomina, autorizzazione e disattivazione dalla dashboard</w:t>
-            </w:r>
-          </w:p>
-        </w:tc>
-      </w:tr>
-      <w:tr>
-        <w:trPr>
-          <w:cantSplit/>
-        </w:trPr>
-        <w:tc>
-          <w:tcPr>
-            <w:tcW w:type="dxa" w:w="4762"/>
-            <w:tcMar>
-              <w:top w:w="95" w:type="dxa"/>
-              <w:left w:w="95" w:type="dxa"/>
-              <w:bottom w:w="95" w:type="dxa"/>
-              <w:right w:w="95" w:type="dxa"/>
-            </w:tcMar>
-          </w:tcPr>
-          <w:p>
-            <w:pPr>
-              <w:pStyle w:val="GuideTable"/>
-            </w:pPr>
-            <w:r>
-              <w:rPr>
-                <w:b w:val="0"/>
-              </w:rPr>
-              <w:t>Lettura dei messaggi</w:t>
-            </w:r>
-          </w:p>
-        </w:tc>
-        <w:tc>
-          <w:tcPr>
-            <w:tcW w:type="dxa" w:w="4762"/>
-            <w:tcMar>
-              <w:top w:w="95" w:type="dxa"/>
-              <w:left w:w="95" w:type="dxa"/>
-              <w:bottom w:w="95" w:type="dxa"/>
-              <w:right w:w="95" w:type="dxa"/>
-            </w:tcMar>
-          </w:tcPr>
-          <w:p>
-            <w:pPr>
-              <w:pStyle w:val="GuideTable"/>
-            </w:pPr>
-            <w:r>
-              <w:rPr>
-                <w:b w:val="0"/>
-              </w:rPr>
-              <w:t>Implementata e collaudata con dati di prova; richiede credenziali e account Telegram collegato</w:t>
-            </w:r>
-          </w:p>
-        </w:tc>
-      </w:tr>
-      <w:tr>
-        <w:trPr>
-          <w:cantSplit/>
-        </w:trPr>
-        <w:tc>
-          <w:tcPr>
-            <w:tcW w:type="dxa" w:w="4762"/>
-            <w:tcMar>
-              <w:top w:w="95" w:type="dxa"/>
-              <w:left w:w="95" w:type="dxa"/>
-              <w:bottom w:w="95" w:type="dxa"/>
-              <w:right w:w="95" w:type="dxa"/>
-            </w:tcMar>
-          </w:tcPr>
-          <w:p>
-            <w:pPr>
-              <w:pStyle w:val="GuideTable"/>
-            </w:pPr>
-            <w:r>
-              <w:rPr>
-                <w:b w:val="0"/>
-              </w:rPr>
-              <w:t>Messaggi Telegram</w:t>
-            </w:r>
-          </w:p>
-        </w:tc>
-        <w:tc>
-          <w:tcPr>
-            <w:tcW w:type="dxa" w:w="4762"/>
-            <w:tcMar>
-              <w:top w:w="95" w:type="dxa"/>
-              <w:left w:w="95" w:type="dxa"/>
-              <w:bottom w:w="95" w:type="dxa"/>
-              <w:right w:w="95" w:type="dxa"/>
-            </w:tcMar>
-          </w:tcPr>
-          <w:p>
-            <w:pPr>
-              <w:pStyle w:val="GuideTable"/>
-            </w:pPr>
-            <w:r>
-              <w:rPr>
-                <w:b w:val="0"/>
-              </w:rPr>
-              <w:t>Consultazione di un’anteprima del testo e dell’evento più recente, con numero di versione</w:t>
-            </w:r>
-          </w:p>
-        </w:tc>
-      </w:tr>
-      <w:tr>
-        <w:trPr>
-          <w:cantSplit/>
-        </w:trPr>
-        <w:tc>
-          <w:tcPr>
-            <w:tcW w:type="dxa" w:w="4762"/>
-            <w:tcMar>
-              <w:top w:w="95" w:type="dxa"/>
-              <w:left w:w="95" w:type="dxa"/>
-              <w:bottom w:w="95" w:type="dxa"/>
-              <w:right w:w="95" w:type="dxa"/>
-            </w:tcMar>
-          </w:tcPr>
-          <w:p>
-            <w:pPr>
-              <w:pStyle w:val="GuideTable"/>
-            </w:pPr>
-            <w:r>
-              <w:rPr>
-                <w:b w:val="0"/>
-              </w:rPr>
-              <w:t>Configurazioni e registro attività</w:t>
-            </w:r>
-          </w:p>
-        </w:tc>
-        <w:tc>
-          <w:tcPr>
-            <w:tcW w:type="dxa" w:w="4762"/>
-            <w:tcMar>
-              <w:top w:w="95" w:type="dxa"/>
-              <w:left w:w="95" w:type="dxa"/>
-              <w:bottom w:w="95" w:type="dxa"/>
-              <w:right w:w="95" w:type="dxa"/>
-            </w:tcMar>
-          </w:tcPr>
-          <w:p>
-            <w:pPr>
-              <w:pStyle w:val="GuideTable"/>
-            </w:pPr>
-            <w:r>
-              <w:rPr>
-                <w:b w:val="0"/>
-              </w:rPr>
-              <w:t>Modifiche confermate e registrate; limiti di rischio modificabili soltanto in senso più restrittivo</w:t>
-            </w:r>
-          </w:p>
-        </w:tc>
-      </w:tr>
-      <w:tr>
-        <w:trPr>
-          <w:cantSplit/>
-        </w:trPr>
-        <w:tc>
-          <w:tcPr>
-            <w:tcW w:type="dxa" w:w="4762"/>
-            <w:tcMar>
-              <w:top w:w="95" w:type="dxa"/>
-              <w:left w:w="95" w:type="dxa"/>
-              <w:bottom w:w="95" w:type="dxa"/>
-              <w:right w:w="95" w:type="dxa"/>
-            </w:tcMar>
-          </w:tcPr>
-          <w:p>
-            <w:pPr>
-              <w:pStyle w:val="GuideTable"/>
-            </w:pPr>
-            <w:r>
-              <w:rPr>
-                <w:b w:val="0"/>
-              </w:rPr>
-              <w:t>Analisi messaggi</w:t>
-            </w:r>
-          </w:p>
-        </w:tc>
-        <w:tc>
-          <w:tcPr>
-            <w:tcW w:type="dxa" w:w="4762"/>
-            <w:tcMar>
-              <w:top w:w="95" w:type="dxa"/>
-              <w:left w:w="95" w:type="dxa"/>
-              <w:bottom w:w="95" w:type="dxa"/>
-              <w:right w:w="95" w:type="dxa"/>
-            </w:tcMar>
-          </w:tcPr>
-          <w:p>
-            <w:pPr>
-              <w:pStyle w:val="GuideTable"/>
-            </w:pPr>
-            <w:r>
-              <w:rPr>
-                <w:b w:val="0"/>
-              </w:rPr>
-              <w:t>Classificazione locale, motivi di arresto e collegamento alle proposte; collaudata con dati di prova</w:t>
-            </w:r>
-          </w:p>
-        </w:tc>
-      </w:tr>
-      <w:tr>
-        <w:trPr>
-          <w:cantSplit/>
-        </w:trPr>
-        <w:tc>
-          <w:tcPr>
-            <w:tcW w:type="dxa" w:w="4762"/>
-            <w:tcMar>
-              <w:top w:w="95" w:type="dxa"/>
-              <w:left w:w="95" w:type="dxa"/>
-              <w:bottom w:w="95" w:type="dxa"/>
-              <w:right w:w="95" w:type="dxa"/>
-            </w:tcMar>
-          </w:tcPr>
-          <w:p>
-            <w:pPr>
-              <w:pStyle w:val="GuideTable"/>
-            </w:pPr>
-            <w:r>
-              <w:rPr>
-                <w:b w:val="0"/>
-              </w:rPr>
-              <w:t>Agenti IA</w:t>
-            </w:r>
-          </w:p>
-        </w:tc>
-        <w:tc>
-          <w:tcPr>
-            <w:tcW w:type="dxa" w:w="4762"/>
-            <w:tcMar>
-              <w:top w:w="95" w:type="dxa"/>
-              <w:left w:w="95" w:type="dxa"/>
-              <w:bottom w:w="95" w:type="dxa"/>
-              <w:right w:w="95" w:type="dxa"/>
-            </w:tcMar>
-          </w:tcPr>
-          <w:p>
-            <w:pPr>
-              <w:pStyle w:val="GuideTable"/>
-            </w:pPr>
-            <w:r>
-              <w:rPr>
-                <w:b w:val="0"/>
-              </w:rPr>
-              <w:t>Simulatore locale o modelli OpenRouter collaudati dal team; attivazione e costo massimo richiedono conferma</w:t>
-            </w:r>
-          </w:p>
-        </w:tc>
-      </w:tr>
-      <w:tr>
-        <w:trPr>
-          <w:cantSplit/>
-        </w:trPr>
-        <w:tc>
-          <w:tcPr>
-            <w:tcW w:type="dxa" w:w="4762"/>
-            <w:tcMar>
-              <w:top w:w="95" w:type="dxa"/>
-              <w:left w:w="95" w:type="dxa"/>
-              <w:bottom w:w="95" w:type="dxa"/>
-              <w:right w:w="95" w:type="dxa"/>
-            </w:tcMar>
-          </w:tcPr>
-          <w:p>
-            <w:pPr>
-              <w:pStyle w:val="GuideTable"/>
-            </w:pPr>
-            <w:r>
-              <w:rPr>
-                <w:b w:val="0"/>
-              </w:rPr>
-              <w:t>Accesso remoto</w:t>
-            </w:r>
-          </w:p>
-        </w:tc>
-        <w:tc>
-          <w:tcPr>
-            <w:tcW w:type="dxa" w:w="4762"/>
-            <w:tcMar>
-              <w:top w:w="95" w:type="dxa"/>
-              <w:left w:w="95" w:type="dxa"/>
-              <w:bottom w:w="95" w:type="dxa"/>
-              <w:right w:w="95" w:type="dxa"/>
-            </w:tcMar>
-          </w:tcPr>
-          <w:p>
-            <w:pPr>
-              <w:pStyle w:val="GuideTable"/>
-            </w:pPr>
-            <w:r>
-              <w:rPr>
-                <w:b w:val="0"/>
-              </w:rPr>
-              <w:t>Predisposto con verifica dell’identità e MFA; il dominio cliente richiede ancora configurazione e collaudo</w:t>
-            </w:r>
-          </w:p>
-        </w:tc>
-      </w:tr>
-      <w:tr>
-        <w:trPr>
-          <w:cantSplit/>
-        </w:trPr>
-        <w:tc>
-          <w:tcPr>
-            <w:tcW w:type="dxa" w:w="4762"/>
-            <w:tcMar>
-              <w:top w:w="95" w:type="dxa"/>
-              <w:left w:w="95" w:type="dxa"/>
-              <w:bottom w:w="95" w:type="dxa"/>
-              <w:right w:w="95" w:type="dxa"/>
-            </w:tcMar>
-          </w:tcPr>
-          <w:p>
-            <w:pPr>
-              <w:pStyle w:val="GuideTable"/>
-            </w:pPr>
-            <w:r>
-              <w:rPr>
-                <w:b w:val="0"/>
-              </w:rPr>
-              <w:t>OpenRouter</w:t>
-            </w:r>
-          </w:p>
-        </w:tc>
-        <w:tc>
-          <w:tcPr>
-            <w:tcW w:type="dxa" w:w="4762"/>
-            <w:tcMar>
-              <w:top w:w="95" w:type="dxa"/>
-              <w:left w:w="95" w:type="dxa"/>
-              <w:bottom w:w="95" w:type="dxa"/>
-              <w:right w:w="95" w:type="dxa"/>
-            </w:tcMar>
-          </w:tcPr>
-          <w:p>
-            <w:pPr>
-              <w:pStyle w:val="GuideTable"/>
-            </w:pPr>
-            <w:r>
-              <w:rPr>
-                <w:b w:val="0"/>
-              </w:rPr>
-              <w:t>Integrato e verificato con dati di prova; disattivato finché mancano account e collaudo reale</w:t>
-            </w:r>
-          </w:p>
-        </w:tc>
-      </w:tr>
-      <w:tr>
-        <w:trPr>
-          <w:cantSplit/>
-        </w:trPr>
-        <w:tc>
-          <w:tcPr>
-            <w:tcW w:type="dxa" w:w="4762"/>
-            <w:tcMar>
-              <w:top w:w="95" w:type="dxa"/>
-              <w:left w:w="95" w:type="dxa"/>
-              <w:bottom w:w="95" w:type="dxa"/>
-              <w:right w:w="95" w:type="dxa"/>
-            </w:tcMar>
-          </w:tcPr>
-          <w:p>
-            <w:pPr>
-              <w:pStyle w:val="GuideTable"/>
-            </w:pPr>
-            <w:r>
-              <w:rPr>
-                <w:b w:val="0"/>
-              </w:rPr>
-              <w:t>Broker</w:t>
-            </w:r>
-          </w:p>
-        </w:tc>
-        <w:tc>
-          <w:tcPr>
-            <w:tcW w:type="dxa" w:w="4762"/>
-            <w:tcMar>
-              <w:top w:w="95" w:type="dxa"/>
-              <w:left w:w="95" w:type="dxa"/>
-              <w:bottom w:w="95" w:type="dxa"/>
-              <w:right w:w="95" w:type="dxa"/>
-            </w:tcMar>
-          </w:tcPr>
-          <w:p>
-            <w:pPr>
-              <w:pStyle w:val="GuideTable"/>
-            </w:pPr>
-            <w:r>
-              <w:rPr>
-                <w:b w:val="0"/>
-              </w:rPr>
-              <w:t>Disabilitato; motore di rischio ed esecuzione appartengono alle fasi successive</w:t>
+              <w:t>Da implementare e collaudare; trading disabilitato</w:t>
             </w:r>
           </w:p>
         </w:tc>
@@ -706,32 +551,180 @@
         <w:pStyle w:val="Heading1"/>
       </w:pPr>
       <w:r>
-        <w:t>Accesso e ruoli</w:t>
+        <w:t>Accedere e scegliere le fonti</w:t>
+      </w:r>
+    </w:p>
+    <w:p>
+      <w:pPr>
+        <w:pStyle w:val="ListNumber"/>
+        <w:keepNext/>
+        <w:numPr>
+          <w:numId w:val="10"/>
+        </w:numPr>
+      </w:pPr>
+      <w:r>
+        <w:t xml:space="preserve">Apri l’indirizzo comunicato dal team; in locale è </w:t>
+      </w:r>
+      <w:r>
+        <w:rPr>
+          <w:rFonts w:ascii="Liberation Mono" w:hAnsi="Liberation Mono"/>
+          <w:sz w:val="18"/>
+        </w:rPr>
+        <w:t>http://localhost:3000</w:t>
+      </w:r>
+      <w:r>
+        <w:t>. Usa email e password personali. Il lettore consulta; l’amministratore salva modifiche confermate.</w:t>
+      </w:r>
+    </w:p>
+    <w:p>
+      <w:pPr>
+        <w:pStyle w:val="ListNumber"/>
+        <w:keepNext/>
+        <w:numPr>
+          <w:numId w:val="10"/>
+        </w:numPr>
+      </w:pPr>
+      <w:r>
+        <w:t xml:space="preserve">In </w:t>
+      </w:r>
+      <w:r>
+        <w:rPr>
+          <w:b/>
+        </w:rPr>
+        <w:t>Fonti Telegram</w:t>
+      </w:r>
+      <w:r>
+        <w:t xml:space="preserve">, scegli </w:t>
+      </w:r>
+      <w:r>
+        <w:rPr>
+          <w:b/>
+        </w:rPr>
+        <w:t>Aggiungi fonte</w:t>
+      </w:r>
+      <w:r>
+        <w:t xml:space="preserve">. Inserisci nome e riferimento: </w:t>
+      </w:r>
+      <w:r>
+        <w:rPr>
+          <w:rFonts w:ascii="Liberation Mono" w:hAnsi="Liberation Mono"/>
+          <w:sz w:val="18"/>
+        </w:rPr>
+        <w:t>@nomecanale</w:t>
+      </w:r>
+      <w:r>
+        <w:t>, link pubblico o identificativo del gruppo fornito dal team.</w:t>
+      </w:r>
+    </w:p>
+    <w:p>
+      <w:pPr>
+        <w:pStyle w:val="ListNumber"/>
+        <w:keepNext/>
+        <w:numPr>
+          <w:numId w:val="10"/>
+        </w:numPr>
+      </w:pPr>
+      <w:r>
+        <w:t xml:space="preserve">Imposta la lettura su </w:t>
+      </w:r>
+      <w:r>
+        <w:rPr>
+          <w:b/>
+        </w:rPr>
+        <w:t>Autorizzata</w:t>
+      </w:r>
+      <w:r>
+        <w:t xml:space="preserve">, poi </w:t>
+      </w:r>
+      <w:r>
+        <w:rPr>
+          <w:b/>
+        </w:rPr>
+        <w:t>Rivedi modifica</w:t>
+      </w:r>
+      <w:r>
+        <w:t xml:space="preserve"> e </w:t>
+      </w:r>
+      <w:r>
+        <w:rPr>
+          <w:b/>
+        </w:rPr>
+        <w:t>Conferma e salva</w:t>
+      </w:r>
+      <w:r>
+        <w:t>. Per i gruppi privati l’account deve già avere accesso. TRD non si iscrive automaticamente.</w:t>
+      </w:r>
+    </w:p>
+    <w:p>
+      <w:pPr>
+        <w:pStyle w:val="ListNumber"/>
+        <w:keepNext w:val="0"/>
+        <w:numPr>
+          <w:numId w:val="10"/>
+        </w:numPr>
+      </w:pPr>
+      <w:r>
+        <w:t xml:space="preserve">Controlla </w:t>
+      </w:r>
+      <w:r>
+        <w:rPr>
+          <w:b/>
+        </w:rPr>
+        <w:t>Lettura verificata</w:t>
+      </w:r>
+      <w:r>
+        <w:t xml:space="preserve"> e </w:t>
+      </w:r>
+      <w:r>
+        <w:rPr>
+          <w:b/>
+        </w:rPr>
+        <w:t>Ultima verifica</w:t>
+      </w:r>
+      <w:r>
+        <w:t xml:space="preserve">. Una fonte salvata può essere ancora in attesa del collegamento. Usa </w:t>
+      </w:r>
+      <w:r>
+        <w:rPr>
+          <w:b/>
+        </w:rPr>
+        <w:t>Aggiorna dati</w:t>
+      </w:r>
+      <w:r>
+        <w:t xml:space="preserve"> per leggere lo stato recente.</w:t>
       </w:r>
     </w:p>
     <w:p>
       <w:r>
-        <w:t>Apri la dashboard all’indirizzo comunicato dal team. Nell’installazione locale è http://localhost:3000. Inserisci l’email e la password del tuo utente. Il team deve predisporre un’utenza nominativa; le credenziali iniziali del server non devono essere condivise fra clienti.</w:t>
+        <w:t xml:space="preserve">Il team collega Telegram con una procedura locale: </w:t>
+      </w:r>
+      <w:r>
+        <w:rPr>
+          <w:b/>
+        </w:rPr>
+        <w:t>telefono, codici e password Telegram non vanno nella dashboard</w:t>
+      </w:r>
+      <w:r>
+        <w:t>. Puoi rinominare o disattivare una fonte; per cambiare canale aggiungine una nuova. Massimo 32 fonti per ambiente.</w:t>
       </w:r>
     </w:p>
     <w:p>
       <w:r>
-        <w:t>L’amministratore può consultare le pagine e proporre modifiche. Il lettore può consultare i dati e non dispone dei controlli per salvare configurazioni. Anche il servizio verifica il ruolo: un controllo nascosto nella pagina non costituisce l’unica protezione.</w:t>
+        <w:t xml:space="preserve">La sessione TRD scade dopo 30 minuti di inattività o 8 ore totali. Usa </w:t>
+      </w:r>
+      <w:r>
+        <w:rPr>
+          <w:b/>
+        </w:rPr>
+        <w:t>Esci</w:t>
+      </w:r>
+      <w:r>
+        <w:t xml:space="preserve"> sui dispositivi condivisi; utenti e recupero password richiedono il team. Il tema chiaro o scuro è selezionabile anche all’accesso e su mobile: la scelta resta nel browser per un anno. Le date sono mostrate nel fuso italiano.</w:t>
       </w:r>
     </w:p>
     <w:p>
       <w:r>
-        <w:t>La sessione termina dopo trenta minuti di inattività oppure, comunque, dopo otto ore dall’accesso. In caso di scadenza accedi nuovamente. Usa Esci quando hai finito, soprattutto su un dispositivo condiviso. Il ripristino della password e la gestione degli utenti richiedono attualmente l’intervento del team.</w:t>
-      </w:r>
-    </w:p>
-    <w:p>
-      <w:r>
-        <w:t>Quando il team consegnerà l’indirizzo remoto, apri esattamente il dominio protetto comunicato. Completa la verifica dell’identità e il secondo fattore, poi accedi a TRD con la stessa email autorizzata e la password personale. Un link di anteprima diverso dal dominio approvato non consente di leggere i dati. L’accesso remoto va consegnato soltanto dopo un collaudo reale della protezione.</w:t>
-      </w:r>
-    </w:p>
-    <w:p>
-      <w:r>
-        <w:t>Staging è l’ambiente di prova; produzione è quello destinato al cliente. I due ambienti hanno dati e account separati. La parola produzione indica l’ambiente di distribuzione e non significa trading reale: gli ordini restano disabilitati anche lì.</w:t>
+        <w:t>Per l’accesso remoto usa il dominio protetto consegnato dal team, completa MFA e accedi a TRD con la stessa email autorizzata. Staging e produzione hanno dati e account separati; produzione non significa trading reale.</w:t>
       </w:r>
     </w:p>
     <w:p>
@@ -739,93 +732,42 @@
         <w:pStyle w:val="Heading1"/>
       </w:pPr>
       <w:r>
-        <w:t>Scegliere il tema della dashboard</w:t>
+        <w:t>Capire messaggi e analisi</w:t>
       </w:r>
     </w:p>
     <w:p>
       <w:r>
-        <w:t>La dashboard si apre inizialmente con il tema scuro. Usa Passa al tema chiaro nella parte superiore delle pagine; il pulsante diventa Passa al tema scuro per tornare alla modalità precedente. Il comando è disponibile anche sotto il modulo di accesso e sulle schermate mobili.</w:t>
+        <w:t xml:space="preserve">In </w:t>
+      </w:r>
+      <w:r>
+        <w:rPr>
+          <w:b/>
+        </w:rPr>
+        <w:t>Messaggi Telegram</w:t>
+      </w:r>
+      <w:r>
+        <w:t xml:space="preserve"> trovi anteprima, fonte, evento e versione. TRD conserva revisioni e cancellazioni osservate, evita duplicati e non apre link né scarica allegati. La lettura iniziale è ogni 30 secondi; il recupero dopo una pausa copre fino a 24 ore. Eventi scomparsi prima dell’osservazione o fuori finestra possono mancare.</w:t>
       </w:r>
     </w:p>
     <w:p>
       <w:r>
-        <w:t>La scelta resta valida dopo un aggiornamento della pagina o un nuovo accesso dallo stesso browser, per un massimo di un anno. È una preferenza del browser, condivisa dagli utenti che lo utilizzano sullo stesso indirizzo; cancellare i cookie ripristina il tema scuro. Non occorrono configurazioni o account aggiuntivi.</w:t>
+        <w:t>Un segnale deve contenere direzione, strumento, ingresso, stop loss e take profit. Esempio inventato, solo per spiegare il formato:</w:t>
       </w:r>
     </w:p>
     <w:p>
-      <w:pPr>
-        <w:pStyle w:val="Heading1"/>
-      </w:pPr>
+      <w:r/>
       <w:r>
-        <w:t>Inserire una fonte Telegram</w:t>
+        <w:rPr>
+          <w:rFonts w:ascii="Liberation Mono" w:hAnsi="Liberation Mono"/>
+          <w:sz w:val="18"/>
+        </w:rPr>
+        <w:t>BUY EURUSD ENTRY 1.10000 SL 1.09500 TP 1.11000</w:t>
       </w:r>
-    </w:p>
-    <w:p>
-      <w:pPr>
-        <w:pStyle w:val="ListNumber"/>
-        <w:keepNext/>
-      </w:pPr>
-      <w:r>
-        <w:t>Apri Fonti Telegram e seleziona Aggiungi fonte.</w:t>
-      </w:r>
-    </w:p>
-    <w:p>
-      <w:pPr>
-        <w:pStyle w:val="ListNumber"/>
-        <w:keepNext/>
-      </w:pPr>
-      <w:r>
-        <w:t>Inserisci un nome riconoscibile, ad esempio Segnali del gruppo principale.</w:t>
-      </w:r>
-    </w:p>
-    <w:p>
-      <w:pPr>
-        <w:pStyle w:val="ListNumber"/>
-        <w:keepNext/>
-      </w:pPr>
-      <w:r>
-        <w:t>Inserisci @nomecanale, un link pubblico come https://t.me/nomecanale oppure l’identificativo negativo del gruppo fornito dal team.</w:t>
-      </w:r>
-    </w:p>
-    <w:p>
-      <w:pPr>
-        <w:pStyle w:val="ListNumber"/>
-        <w:keepNext/>
-      </w:pPr>
-      <w:r>
-        <w:t>Imposta Lettura dei messaggi su Autorizzata per consentire la raccolta, oppure su Disattivata per preparare una fonte senza leggerla.</w:t>
-      </w:r>
-    </w:p>
-    <w:p>
-      <w:pPr>
-        <w:pStyle w:val="ListNumber"/>
-        <w:keepNext w:val="0"/>
-      </w:pPr>
-      <w:r>
-        <w:t>Seleziona Rivedi modifica, controlla il riepilogo e scegli Conferma e salva.</w:t>
-      </w:r>
+      <w:r/>
     </w:p>
     <w:p>
       <w:r>
-        <w:t>Il salvataggio autorizza la fonte, ma non dimostra ancora che il collegamento sia riuscito. La verifica avviene attraverso l’account Telegram collegato dal team. Per i gruppi privati l’account deve avere già accesso: il sistema non utilizza link di invito e non si iscrive automaticamente. Se serve l’identificativo di un gruppo, chiedilo al team.</w:t>
-      </w:r>
-    </w:p>
-    <w:p>
-      <w:r>
-        <w:t>Una fonte già registrata può essere rinominata o disattivata con Apri fonte. Il riferimento al canale resta fisso per mantenere la provenienza dei messaggi: per cambiare canale, disattiva la fonte precedente e aggiungine una nuova. Sono previste al massimo trentadue fonti per ambiente.</w:t>
-      </w:r>
-    </w:p>
-    <w:p>
-      <w:r>
-        <w:t>I numeri di telefono, i codici di accesso e la password Telegram non vanno inseriti nella dashboard. Il collegamento dell’account viene eseguito dal team attraverso una procedura locale protetta.</w:t>
-      </w:r>
-    </w:p>
-    <w:p>
-      <w:pPr>
-        <w:pStyle w:val="Heading1"/>
-      </w:pPr>
-      <w:r>
-        <w:t>Verificare lo stato della lettura</w:t>
+        <w:t>Sono riconosciuti EURUSD, GBPUSD, USDJPY, USDCHF, AUDUSD, USDCAD e NZDUSD. Questo elenco riguarda il testo; non autorizza operazioni. Il segnale iniziale deve essere completo, non una risposta e pubblicato da non più di 15 minuti. Intervalli, suffissi, più obiettivi o istruzioni extra richiedono revisione. Modifiche e cancellazioni fermano la proposta precedente; le risposte non aprono una seconda proposta.</w:t>
       </w:r>
     </w:p>
     <w:tbl>
@@ -844,8 +786,8 @@
         </w:tblBorders>
       </w:tblPr>
       <w:tblGrid>
-        <w:gridCol w:w="4762"/>
-        <w:gridCol w:w="4762"/>
+        <w:gridCol w:w="4309"/>
+        <w:gridCol w:w="5216"/>
       </w:tblGrid>
       <w:tr>
         <w:trPr>
@@ -854,14 +796,15 @@
         </w:trPr>
         <w:tc>
           <w:tcPr>
-            <w:tcW w:type="dxa" w:w="4762"/>
+            <w:tcW w:type="dxa" w:w="4309"/>
+            <w:vAlign w:val="center"/>
             <w:tcMar>
               <w:top w:w="95" w:type="dxa"/>
               <w:left w:w="95" w:type="dxa"/>
               <w:bottom w:w="95" w:type="dxa"/>
               <w:right w:w="95" w:type="dxa"/>
             </w:tcMar>
-            <w:shd w:fill="F2F2F2"/>
+            <w:shd w:fill="DFEAF3"/>
           </w:tcPr>
           <w:p>
             <w:pPr>
@@ -871,20 +814,21 @@
               <w:rPr>
                 <w:b/>
               </w:rPr>
-              <w:t>Stato della fonte</w:t>
+              <w:t>Esito o stato</w:t>
             </w:r>
           </w:p>
         </w:tc>
         <w:tc>
           <w:tcPr>
-            <w:tcW w:type="dxa" w:w="4762"/>
+            <w:tcW w:type="dxa" w:w="5216"/>
+            <w:vAlign w:val="center"/>
             <w:tcMar>
               <w:top w:w="95" w:type="dxa"/>
               <w:left w:w="95" w:type="dxa"/>
               <w:bottom w:w="95" w:type="dxa"/>
               <w:right w:w="95" w:type="dxa"/>
             </w:tcMar>
-            <w:shd w:fill="F2F2F2"/>
+            <w:shd w:fill="DFEAF3"/>
           </w:tcPr>
           <w:p>
             <w:pPr>
@@ -905,7 +849,8 @@
         </w:trPr>
         <w:tc>
           <w:tcPr>
-            <w:tcW w:type="dxa" w:w="4762"/>
+            <w:tcW w:type="dxa" w:w="4309"/>
+            <w:vAlign w:val="center"/>
             <w:tcMar>
               <w:top w:w="95" w:type="dxa"/>
               <w:left w:w="95" w:type="dxa"/>
@@ -921,13 +866,14 @@
               <w:rPr>
                 <w:b w:val="0"/>
               </w:rPr>
-              <w:t>In attesa del collegamento</w:t>
+              <w:t>Ignorato</w:t>
             </w:r>
           </w:p>
         </w:tc>
         <w:tc>
           <w:tcPr>
-            <w:tcW w:type="dxa" w:w="4762"/>
+            <w:tcW w:type="dxa" w:w="5216"/>
+            <w:vAlign w:val="center"/>
             <w:tcMar>
               <w:top w:w="95" w:type="dxa"/>
               <w:left w:w="95" w:type="dxa"/>
@@ -943,7 +889,7 @@
               <w:rPr>
                 <w:b w:val="0"/>
               </w:rPr>
-              <w:t>La fonte è salvata; l’account o la verifica non sono ancora disponibili</w:t>
+              <w:t>Non è stato riconosciuto un segnale</w:t>
             </w:r>
           </w:p>
         </w:tc>
@@ -954,7 +900,61 @@
         </w:trPr>
         <w:tc>
           <w:tcPr>
-            <w:tcW w:type="dxa" w:w="4762"/>
+            <w:tcW w:type="dxa" w:w="4309"/>
+            <w:vAlign w:val="center"/>
+            <w:tcMar>
+              <w:top w:w="95" w:type="dxa"/>
+              <w:left w:w="95" w:type="dxa"/>
+              <w:bottom w:w="95" w:type="dxa"/>
+              <w:right w:w="95" w:type="dxa"/>
+            </w:tcMar>
+            <w:shd w:fill="F5F8FA"/>
+          </w:tcPr>
+          <w:p>
+            <w:pPr>
+              <w:pStyle w:val="GuideTable"/>
+            </w:pPr>
+            <w:r>
+              <w:rPr>
+                <w:b w:val="0"/>
+              </w:rPr>
+              <w:t>Richiede revisione</w:t>
+            </w:r>
+          </w:p>
+        </w:tc>
+        <w:tc>
+          <w:tcPr>
+            <w:tcW w:type="dxa" w:w="5216"/>
+            <w:vAlign w:val="center"/>
+            <w:tcMar>
+              <w:top w:w="95" w:type="dxa"/>
+              <w:left w:w="95" w:type="dxa"/>
+              <w:bottom w:w="95" w:type="dxa"/>
+              <w:right w:w="95" w:type="dxa"/>
+            </w:tcMar>
+            <w:shd w:fill="F5F8FA"/>
+          </w:tcPr>
+          <w:p>
+            <w:pPr>
+              <w:pStyle w:val="GuideTable"/>
+            </w:pPr>
+            <w:r>
+              <w:rPr>
+                <w:b w:val="0"/>
+              </w:rPr>
+              <w:t>Testo ambiguo, risposta, modifica o configurazione incompleta; verifica con il team</w:t>
+            </w:r>
+          </w:p>
+        </w:tc>
+      </w:tr>
+      <w:tr>
+        <w:trPr>
+          <w:cantSplit/>
+        </w:trPr>
+        <w:tc>
+          <w:tcPr>
+            <w:tcW w:type="dxa" w:w="4309"/>
+            <w:vAlign w:val="center"/>
             <w:tcMar>
               <w:top w:w="95" w:type="dxa"/>
               <w:left w:w="95" w:type="dxa"/>
@@ -970,13 +970,14 @@
               <w:rPr>
                 <w:b w:val="0"/>
               </w:rPr>
-              <w:t>Lettura verificata</w:t>
+              <w:t>Scaduto</w:t>
             </w:r>
           </w:p>
         </w:tc>
         <w:tc>
           <w:tcPr>
-            <w:tcW w:type="dxa" w:w="4762"/>
+            <w:tcW w:type="dxa" w:w="5216"/>
+            <w:vAlign w:val="center"/>
             <w:tcMar>
               <w:top w:w="95" w:type="dxa"/>
               <w:left w:w="95" w:type="dxa"/>
@@ -992,7 +993,7 @@
               <w:rPr>
                 <w:b w:val="0"/>
               </w:rPr>
-              <w:t>Una lettura recente è riuscita; controlla anche Ultima verifica</w:t>
+              <w:t>Superata la finestra per l’analisi del segnale</w:t>
             </w:r>
           </w:p>
         </w:tc>
@@ -1003,7 +1004,61 @@
         </w:trPr>
         <w:tc>
           <w:tcPr>
-            <w:tcW w:type="dxa" w:w="4762"/>
+            <w:tcW w:type="dxa" w:w="4309"/>
+            <w:vAlign w:val="center"/>
+            <w:tcMar>
+              <w:top w:w="95" w:type="dxa"/>
+              <w:left w:w="95" w:type="dxa"/>
+              <w:bottom w:w="95" w:type="dxa"/>
+              <w:right w:w="95" w:type="dxa"/>
+            </w:tcMar>
+            <w:shd w:fill="F5F8FA"/>
+          </w:tcPr>
+          <w:p>
+            <w:pPr>
+              <w:pStyle w:val="GuideTable"/>
+            </w:pPr>
+            <w:r>
+              <w:rPr>
+                <w:b w:val="0"/>
+              </w:rPr>
+              <w:t>In attesa</w:t>
+            </w:r>
+          </w:p>
+        </w:tc>
+        <w:tc>
+          <w:tcPr>
+            <w:tcW w:type="dxa" w:w="5216"/>
+            <w:vAlign w:val="center"/>
+            <w:tcMar>
+              <w:top w:w="95" w:type="dxa"/>
+              <w:left w:w="95" w:type="dxa"/>
+              <w:bottom w:w="95" w:type="dxa"/>
+              <w:right w:w="95" w:type="dxa"/>
+            </w:tcMar>
+            <w:shd w:fill="F5F8FA"/>
+          </w:tcPr>
+          <w:p>
+            <w:pPr>
+              <w:pStyle w:val="GuideTable"/>
+            </w:pPr>
+            <w:r>
+              <w:rPr>
+                <w:b w:val="0"/>
+              </w:rPr>
+              <w:t>Proposta consultiva; mancano conto e mercato verificati e collegamento all’esecuzione</w:t>
+            </w:r>
+          </w:p>
+        </w:tc>
+      </w:tr>
+      <w:tr>
+        <w:trPr>
+          <w:cantSplit/>
+        </w:trPr>
+        <w:tc>
+          <w:tcPr>
+            <w:tcW w:type="dxa" w:w="4309"/>
+            <w:vAlign w:val="center"/>
             <w:tcMar>
               <w:top w:w="95" w:type="dxa"/>
               <w:left w:w="95" w:type="dxa"/>
@@ -1019,13 +1074,14 @@
               <w:rPr>
                 <w:b w:val="0"/>
               </w:rPr>
-              <w:t>Recupero in corso</w:t>
+              <w:t>Fonte non accessibile o interruzione da verificare</w:t>
             </w:r>
           </w:p>
         </w:tc>
         <w:tc>
           <w:tcPr>
-            <w:tcW w:type="dxa" w:w="4762"/>
+            <w:tcW w:type="dxa" w:w="5216"/>
+            <w:vAlign w:val="center"/>
             <w:tcMar>
               <w:top w:w="95" w:type="dxa"/>
               <w:left w:w="95" w:type="dxa"/>
@@ -1041,7 +1097,7 @@
               <w:rPr>
                 <w:b w:val="0"/>
               </w:rPr>
-              <w:t>Il servizio sta recuperando una parte della cronologia</w:t>
+              <w:t>Comunica al team fonte, stato e ora</w:t>
             </w:r>
           </w:p>
         </w:tc>
@@ -1052,111 +1108,15 @@
         </w:trPr>
         <w:tc>
           <w:tcPr>
-            <w:tcW w:type="dxa" w:w="4762"/>
+            <w:tcW w:type="dxa" w:w="4309"/>
+            <w:vAlign w:val="center"/>
             <w:tcMar>
               <w:top w:w="95" w:type="dxa"/>
               <w:left w:w="95" w:type="dxa"/>
               <w:bottom w:w="95" w:type="dxa"/>
               <w:right w:w="95" w:type="dxa"/>
             </w:tcMar>
-          </w:tcPr>
-          <w:p>
-            <w:pPr>
-              <w:pStyle w:val="GuideTable"/>
-            </w:pPr>
-            <w:r>
-              <w:rPr>
-                <w:b w:val="0"/>
-              </w:rPr>
-              <w:t>Interruzione da verificare</w:t>
-            </w:r>
-          </w:p>
-        </w:tc>
-        <w:tc>
-          <w:tcPr>
-            <w:tcW w:type="dxa" w:w="4762"/>
-            <w:tcMar>
-              <w:top w:w="95" w:type="dxa"/>
-              <w:left w:w="95" w:type="dxa"/>
-              <w:bottom w:w="95" w:type="dxa"/>
-              <w:right w:w="95" w:type="dxa"/>
-            </w:tcMar>
-          </w:tcPr>
-          <w:p>
-            <w:pPr>
-              <w:pStyle w:val="GuideTable"/>
-            </w:pPr>
-            <w:r>
-              <w:rPr>
-                <w:b w:val="0"/>
-              </w:rPr>
-              <w:t>La pausa supera la finestra di recupero; il team deve valutare il periodo non coperto</w:t>
-            </w:r>
-          </w:p>
-        </w:tc>
-      </w:tr>
-      <w:tr>
-        <w:trPr>
-          <w:cantSplit/>
-        </w:trPr>
-        <w:tc>
-          <w:tcPr>
-            <w:tcW w:type="dxa" w:w="4762"/>
-            <w:tcMar>
-              <w:top w:w="95" w:type="dxa"/>
-              <w:left w:w="95" w:type="dxa"/>
-              <w:bottom w:w="95" w:type="dxa"/>
-              <w:right w:w="95" w:type="dxa"/>
-            </w:tcMar>
-          </w:tcPr>
-          <w:p>
-            <w:pPr>
-              <w:pStyle w:val="GuideTable"/>
-            </w:pPr>
-            <w:r>
-              <w:rPr>
-                <w:b w:val="0"/>
-              </w:rPr>
-              <w:t>Fonte non accessibile</w:t>
-            </w:r>
-          </w:p>
-        </w:tc>
-        <w:tc>
-          <w:tcPr>
-            <w:tcW w:type="dxa" w:w="4762"/>
-            <w:tcMar>
-              <w:top w:w="95" w:type="dxa"/>
-              <w:left w:w="95" w:type="dxa"/>
-              <w:bottom w:w="95" w:type="dxa"/>
-              <w:right w:w="95" w:type="dxa"/>
-            </w:tcMar>
-          </w:tcPr>
-          <w:p>
-            <w:pPr>
-              <w:pStyle w:val="GuideTable"/>
-            </w:pPr>
-            <w:r>
-              <w:rPr>
-                <w:b w:val="0"/>
-              </w:rPr>
-              <w:t>Il canale non è disponibile o l’account non dispone dell’accesso necessario</w:t>
-            </w:r>
-          </w:p>
-        </w:tc>
-      </w:tr>
-      <w:tr>
-        <w:trPr>
-          <w:cantSplit/>
-        </w:trPr>
-        <w:tc>
-          <w:tcPr>
-            <w:tcW w:type="dxa" w:w="4762"/>
-            <w:tcMar>
-              <w:top w:w="95" w:type="dxa"/>
-              <w:left w:w="95" w:type="dxa"/>
-              <w:bottom w:w="95" w:type="dxa"/>
-              <w:right w:w="95" w:type="dxa"/>
-            </w:tcMar>
+            <w:shd w:fill="F5F8FA"/>
           </w:tcPr>
           <w:p>
             <w:pPr>
@@ -1172,13 +1132,15 @@
         </w:tc>
         <w:tc>
           <w:tcPr>
-            <w:tcW w:type="dxa" w:w="4762"/>
+            <w:tcW w:type="dxa" w:w="5216"/>
+            <w:vAlign w:val="center"/>
             <w:tcMar>
               <w:top w:w="95" w:type="dxa"/>
               <w:left w:w="95" w:type="dxa"/>
               <w:bottom w:w="95" w:type="dxa"/>
               <w:right w:w="95" w:type="dxa"/>
             </w:tcMar>
+            <w:shd w:fill="F5F8FA"/>
           </w:tcPr>
           <w:p>
             <w:pPr>
@@ -1188,105 +1150,7 @@
               <w:rPr>
                 <w:b w:val="0"/>
               </w:rPr>
-              <w:t>Telegram richiede una pausa; non occorre reinserire la fonte</w:t>
-            </w:r>
-          </w:p>
-        </w:tc>
-      </w:tr>
-      <w:tr>
-        <w:trPr>
-          <w:cantSplit/>
-        </w:trPr>
-        <w:tc>
-          <w:tcPr>
-            <w:tcW w:type="dxa" w:w="4762"/>
-            <w:tcMar>
-              <w:top w:w="95" w:type="dxa"/>
-              <w:left w:w="95" w:type="dxa"/>
-              <w:bottom w:w="95" w:type="dxa"/>
-              <w:right w:w="95" w:type="dxa"/>
-            </w:tcMar>
-          </w:tcPr>
-          <w:p>
-            <w:pPr>
-              <w:pStyle w:val="GuideTable"/>
-            </w:pPr>
-            <w:r>
-              <w:rPr>
-                <w:b w:val="0"/>
-              </w:rPr>
-              <w:t>Da verificare</w:t>
-            </w:r>
-          </w:p>
-        </w:tc>
-        <w:tc>
-          <w:tcPr>
-            <w:tcW w:type="dxa" w:w="4762"/>
-            <w:tcMar>
-              <w:top w:w="95" w:type="dxa"/>
-              <w:left w:w="95" w:type="dxa"/>
-              <w:bottom w:w="95" w:type="dxa"/>
-              <w:right w:w="95" w:type="dxa"/>
-            </w:tcMar>
-          </w:tcPr>
-          <w:p>
-            <w:pPr>
-              <w:pStyle w:val="GuideTable"/>
-            </w:pPr>
-            <w:r>
-              <w:rPr>
-                <w:b w:val="0"/>
-              </w:rPr>
-              <w:t>L’osservazione è troppo vecchia o manca una conferma recente</w:t>
-            </w:r>
-          </w:p>
-        </w:tc>
-      </w:tr>
-      <w:tr>
-        <w:trPr>
-          <w:cantSplit/>
-        </w:trPr>
-        <w:tc>
-          <w:tcPr>
-            <w:tcW w:type="dxa" w:w="4762"/>
-            <w:tcMar>
-              <w:top w:w="95" w:type="dxa"/>
-              <w:left w:w="95" w:type="dxa"/>
-              <w:bottom w:w="95" w:type="dxa"/>
-              <w:right w:w="95" w:type="dxa"/>
-            </w:tcMar>
-          </w:tcPr>
-          <w:p>
-            <w:pPr>
-              <w:pStyle w:val="GuideTable"/>
-            </w:pPr>
-            <w:r>
-              <w:rPr>
-                <w:b w:val="0"/>
-              </w:rPr>
-              <w:t>Disattivata</w:t>
-            </w:r>
-          </w:p>
-        </w:tc>
-        <w:tc>
-          <w:tcPr>
-            <w:tcW w:type="dxa" w:w="4762"/>
-            <w:tcMar>
-              <w:top w:w="95" w:type="dxa"/>
-              <w:left w:w="95" w:type="dxa"/>
-              <w:bottom w:w="95" w:type="dxa"/>
-              <w:right w:w="95" w:type="dxa"/>
-            </w:tcMar>
-          </w:tcPr>
-          <w:p>
-            <w:pPr>
-              <w:pStyle w:val="GuideTable"/>
-            </w:pPr>
-            <w:r>
-              <w:rPr>
-                <w:b w:val="0"/>
-              </w:rPr>
-              <w:t>Il servizio non raccoglie nuovi messaggi da questa fonte</w:t>
+              <w:t>Il servizio rispetta la pausa; non reinserire la fonte</w:t>
             </w:r>
           </w:p>
         </w:tc>
@@ -1298,8 +1162,74 @@
       </w:pPr>
     </w:p>
     <w:p>
+      <w:pPr>
+        <w:pStyle w:val="Heading1"/>
+      </w:pPr>
       <w:r>
-        <w:t>Se lo stato resta inatteso, aggiorna i dati e segnala al team il nome della fonte, lo stato e l’ora dell’ultima verifica. Un dato già caricato non cambia necessariamente da solo: usa Aggiorna dati per consultare una nuova osservazione. Le date della dashboard sono mostrate nel fuso orario italiano.</w:t>
+        <w:t>Agenti IA e costi</w:t>
+      </w:r>
+    </w:p>
+    <w:p>
+      <w:r>
+        <w:t xml:space="preserve">Il percorso usa </w:t>
+      </w:r>
+      <w:r>
+        <w:rPr>
+          <w:b/>
+        </w:rPr>
+        <w:t>classificazione → interpretazione → analisi di mercato → valutazione della decisione</w:t>
+      </w:r>
+      <w:r>
+        <w:t xml:space="preserve">. La </w:t>
+      </w:r>
+      <w:r>
+        <w:rPr>
+          <w:b/>
+        </w:rPr>
+        <w:t>verifica critica</w:t>
+      </w:r>
+      <w:r>
+        <w:t xml:space="preserve"> si aggiunge se attivata; se il server la rende obbligatoria, la sua assenza ferma l’analisi. La revisione delle posizioni resta futura.</w:t>
+      </w:r>
+    </w:p>
+    <w:p>
+      <w:r>
+        <w:t xml:space="preserve">L’amministratore configura gli agenti in </w:t>
+      </w:r>
+      <w:r>
+        <w:rPr>
+          <w:b/>
+        </w:rPr>
+        <w:t>Agenti IA</w:t>
+      </w:r>
+      <w:r>
+        <w:t xml:space="preserve"> con riepilogo e conferma. Non si attivano da soli. Il simulatore costa zero e restituisce attesa perché non osserva mercato o conto. In </w:t>
+      </w:r>
+      <w:r>
+        <w:rPr>
+          <w:b/>
+        </w:rPr>
+        <w:t>Segnali</w:t>
+      </w:r>
+      <w:r>
+        <w:t>, apri il dettaglio per vedere prezzi, motivi e tentativi.</w:t>
+      </w:r>
+    </w:p>
+    <w:p>
+      <w:r>
+        <w:t>OpenRouter richiede collaudo del team, modello approvato non scaduto e costo massimo positivo entro i budget server. Può servire analisi, decisione e critica; classificazione e interpretazione restano locali. Al fornitore va la proposta normalizzata, non il testo Telegram completo. Le chiavi API restano sul server.</w:t>
+      </w:r>
+    </w:p>
+    <w:p>
+      <w:r/>
+      <w:r>
+        <w:rPr>
+          <w:b/>
+        </w:rPr>
+        <w:t>Costi IA</w:t>
+      </w:r>
+      <w:r>
+        <w:t xml:space="preserve"> distingue costo contabilizzato, costo del fornitore e importi prenotati. Un consumo sconosciuto conserva la prenotazione e ferma altri tentativi; chiedi al team la riconciliazione. Un riavvio non libera l’importo né reinvia automaticamente quella richiesta. Anche un esito positivo dell’IA non autorizza un ordine.</w:t>
       </w:r>
     </w:p>
     <w:p>
@@ -1307,27 +1237,63 @@
         <w:pStyle w:val="Heading1"/>
       </w:pPr>
       <w:r>
-        <w:t>Consultare i messaggi e le revisioni</w:t>
+        <w:t>Regole e protezioni</w:t>
       </w:r>
     </w:p>
     <w:p>
       <w:r>
-        <w:t>Apri Messaggi Telegram per consultare la fonte, l’identificativo del messaggio, il tipo di evento e la versione più recente. La pagina mostra un’anteprima di testo fino a 240 caratteri. Non scarica allegati e non apre automaticamente i link contenuti nei messaggi.</w:t>
+        <w:t xml:space="preserve">Ogni modifica amministrativa richiede conferma, valida per 2 minuti e legata alla versione corrente. Se un altro amministratore ha modificato i dati, aggiorna e rivedi. Il </w:t>
+      </w:r>
+      <w:r>
+        <w:rPr>
+          <w:b/>
+        </w:rPr>
+        <w:t>Registro attività</w:t>
+      </w:r>
+      <w:r>
+        <w:t xml:space="preserve"> conserva accessi e cambiamenti.</w:t>
       </w:r>
     </w:p>
     <w:p>
       <w:r>
-        <w:t>La ricezione ripetuta dello stesso evento non aggiunge una nuova versione. Una modifica effettiva conserva una nuova revisione. Una cancellazione viene indicata come tale, mantenendo gli identificativi e lo storico necessari alla ricostruzione. Il numero di messaggi della fonte conta i messaggi distinti, anche quando esistono più revisioni.</w:t>
+        <w:t xml:space="preserve">Nei </w:t>
+      </w:r>
+      <w:r>
+        <w:rPr>
+          <w:b/>
+        </w:rPr>
+        <w:t>Controlli del rischio</w:t>
+      </w:r>
+      <w:r>
+        <w:t xml:space="preserve"> puoi preparare limiti più restrittivi: non puoi aumentare l’autorità del server, eliminare gli stop obbligatori o abilitare il trading reale. Il motore è implementato e verificato con dati di prova: controlla stop, rischio, perdita giornaliera, esposizione, lotti, leva, spread e orari. </w:t>
+      </w:r>
+      <w:r>
+        <w:rPr>
+          <w:b/>
+        </w:rPr>
+        <w:t>I limiti restano preparatori:</w:t>
+      </w:r>
+      <w:r>
+        <w:t xml:space="preserve"> mancano dati autenticati di conto e mercato e collegamento all’esecuzione. Con esposizioni presenti, le modifiche del rischio richiedono il futuro servizio di esecuzione e vengono rifiutate.</w:t>
       </w:r>
     </w:p>
     <w:p>
       <w:r>
-        <w:t>La raccolta viene verificata periodicamente; l’impostazione iniziale è ogni trenta secondi, ma la durata dipende dalle fonti e dalle risposte di Telegram. Dopo una pausa il recupero copre inizialmente una finestra massima di ventiquattro ore. Le revisioni o cancellazioni molto vecchie e gli eventi avvenuti e scomparsi durante un’interruzione possono non essere recuperabili. Un’interruzione oltre questa finestra viene resa visibile.</w:t>
+        <w:t xml:space="preserve">In </w:t>
+      </w:r>
+      <w:r>
+        <w:rPr>
+          <w:b/>
+        </w:rPr>
+        <w:t>Impostazioni</w:t>
+      </w:r>
+      <w:r>
+        <w:t xml:space="preserve"> scegli la conservazione. Il team avvia la pulizia dei contenuti Telegram e IA a piccoli lotti; la pulizia automatica periodica e quella dei log per età non sono disponibili. La rotazione dei log per dimensione è attiva.</w:t>
       </w:r>
     </w:p>
     <w:p>
       <w:r>
-        <w:t>I messaggi sono dati da valutare. La pagina Analisi messaggi mostra l’esito della classificazione e i motivi di arresto. Le proposte riconosciute compaiono anche in Segnali, con le versioni e le valutazioni consultive. Nessun messaggio o risultato del simulatore autorizza un ordine.</w:t>
+        <w:t>Prima della raccolta reale servono collegamento Telegram e prove di lettura, revisioni e recupero. Prima di IA a pagamento e accesso remoto servono account, budget, privacy, dominio e MFA collaudati. Prima di qualsiasi ordine serviranno collegamento del rischio, riconciliazione, MT5 e conto demo verificati; il trading reale richiede ulteriori autorizzazioni indipendenti.</w:t>
       </w:r>
     </w:p>
     <w:p>
@@ -1335,126 +1301,37 @@
         <w:pStyle w:val="Heading1"/>
       </w:pPr>
       <w:r>
-        <w:t>Consultare e configurare l’analisi</w:t>
+        <w:t>Cronologia delle revisioni</w:t>
       </w:r>
     </w:p>
     <w:p>
       <w:r>
-        <w:t>In Analisi messaggi seleziona Aggiorna dati per leggere gli ultimi esiti. Ignorato indica che non è stato riconosciuto un segnale; Richiede revisione indica un formato ambiguo, una modifica, una risposta o una configurazione incompleta; Scaduto indica un messaggio troppo vecchio. In attesa indica una proposta consultiva che non dispone ancora di una verifica del rischio e di dati di mercato verificati.</w:t>
+        <w:t>9 ottobre 2026 — Prima guida con accesso, fonti e raccolta Telegram; account reale da predisporre.</w:t>
       </w:r>
     </w:p>
     <w:p>
       <w:r>
-        <w:t>Il riconoscimento iniziale richiede un solo strumento Forex supportato, direzione, prezzo di ingresso, stop loss e take profit. Il formato deve essere completo e preciso: intervalli di prezzo, più obiettivi, suffissi dello strumento o istruzioni aggiunte richiedono revisione. Il sistema non indovina prezzi o strumenti. La finestra iniziale dell’analisi è di quindici minuti dalla pubblicazione, distinta dal recupero della cronologia Telegram.</w:t>
+        <w:t>11 ottobre 2026 — Analisi consultiva, agenti locali, tentativi e prenotazioni dei costi; trading disabilitato.</w:t>
       </w:r>
     </w:p>
     <w:p>
       <w:r>
-        <w:t>L’amministratore può aprire Agenti IA e attivare Agente attivo per Classificazione dei segnali, Interpretazione dei segnali, Analisi di mercato e Valutazione delle decisioni. Ogni attivazione passa da Rivedi modifica e Conferma e salva; il riepilogo mostra anche la nuova versione delle istruzioni. Gli agenti necessari devono essere tutti configurati. La Verifica critica può essere aggiunta, mentre la Revisione delle posizioni resta indisponibile. Il lettore può consultare le configurazioni senza modificarle.</w:t>
+        <w:t>12 ottobre 2026 — Preparazione Vercel, MFA e OpenRouter; account reali da collaudare, rischio e ordini futuri.</w:t>
       </w:r>
     </w:p>
     <w:p>
       <w:r>
-        <w:t>Il simulatore restituisce attesa perché non osserva quotazioni o conti reali. Apri dettaglio permette di consultare prezzi della proposta, stato e tentativi degli agenti, con modello e versione. I costi del simulatore sono zero; la pagina Costi IA distingue consumi registrati e prenotazioni conservate quando un tentativo è rimasto senza esito confermato. Un riavvio non reinvia automaticamente una richiesta dall’esito sconosciuto.</w:t>
+        <w:t>12 ottobre 2026 — Tema chiaro e scuro verificato anche all’accesso e su mobile.</w:t>
       </w:r>
     </w:p>
     <w:p>
       <w:r>
-        <w:t>Dopo il collaudo del team, i modelli OpenRouter approvati compaiono per Analisi di mercato, Valutazione delle decisioni e Verifica critica, insieme al fornitore e alla scadenza dell’approvazione. Per usarli occorre un costo massimo positivo per richiesta, entro i budget autorizzati dal team. Il simulatore richiede invece costo massimo zero. Classificazione e interpretazione restano locali. La dashboard non richiede chiavi API, credenziali del server o del broker.</w:t>
+        <w:t>12 ottobre 2026 — Guide snellite, diagrammi e rinvii operativi; distinti limiti attuali e funzioni future. Aggiornamenti documentali solo quando necessari.</w:t>
       </w:r>
     </w:p>
     <w:p>
       <w:r>
-        <w:t>I modelli esterni possono generare addebiti. Costi IA mostra separatamente l’importo contabilizzato e il costo confermato dal fornitore. La prenotazione iniziale è prudente e può essere superiore al consumo finale. Se il costo non è confermato, il sistema conserva la prenotazione e ferma ulteriori tentativi; chiedi al team la riconciliazione. Se scade l’approvazione del modello, è necessaria una nuova verifica del team.</w:t>
-      </w:r>
-    </w:p>
-    <w:p>
-      <w:r>
-        <w:t>La proposta normalizzata può essere inviata al fornitore approvato; il testo Telegram completo non viene inviato. Il team deve verificare anche le condizioni di trattamento dei dati dell’account. L’analisi non dispone ancora di dati di mercato verificati e non autorizza ordini, anche quando un modello restituisce una proposta positiva.</w:t>
-      </w:r>
-    </w:p>
-    <w:p>
-      <w:r>
-        <w:t>Modifiche e cancellazioni conservano lo storico e fermano le proposte non inviate. Le risposte a un messaggio richiedono revisione: non producono una seconda proposta di apertura. Disattivare una fonte impedisce nuove elaborazioni autorizzate da quella fonte. Una configurazione modificata durante l’analisi richiede una nuova verifica.</w:t>
-      </w:r>
-    </w:p>
-    <w:p>
-      <w:pPr>
-        <w:pStyle w:val="Heading1"/>
-      </w:pPr>
-      <w:r>
-        <w:t>Modificare le configurazioni</w:t>
-      </w:r>
-    </w:p>
-    <w:p>
-      <w:r>
-        <w:t>Ogni salvataggio amministrativo richiede un riepilogo e una conferma. La conferma vale per due minuti ed è legata all’utente, all’ambiente, ai valori proposti e alla versione corrente. Se un altro amministratore ha modificato gli stessi dati, aggiorna la pagina e rivedi la proposta.</w:t>
-      </w:r>
-    </w:p>
-    <w:p>
-      <w:r>
-        <w:t>Nei Controlli del rischio puoi preparare limiti più restrittivi di quelli correnti. Non puoi aumentare la capacità autorizzata dal server, eliminare gli stop obbligatori o attivare il trading reale. Con esposizioni già presenti, le modifiche del rischio richiedono il futuro servizio di esecuzione e vengono rifiutate.</w:t>
-      </w:r>
-    </w:p>
-    <w:p>
-      <w:r>
-        <w:t>In Impostazioni puoi preparare i periodi di conservazione. La pulizia dei contenuti Telegram e IA viene avviata dal team ed è limitata a piccoli lotti; gli identificativi e le evidenze necessarie alle operazioni restano protetti. Il periodo dei log grezzi è già configurabile, ma la cancellazione dei log per età non è ancora implementata. La rotazione per dimensione e numero di file è attiva.</w:t>
-      </w:r>
-    </w:p>
-    <w:p>
-      <w:r>
-        <w:t>Il Registro attività permette di ricostruire gli accessi e le modifiche. Le versioni precedenti sono conservate: per correggere un valore effettua una nuova modifica confermata. Le conferme impediscono salvataggi involontari, ma non sostituiscono la verifica del contenuto proposto.</w:t>
-      </w:r>
-    </w:p>
-    <w:p>
-      <w:pPr>
-        <w:pStyle w:val="Heading1"/>
-      </w:pPr>
-      <w:r>
-        <w:t>Controlli prima di un utilizzo operativo</w:t>
-      </w:r>
-    </w:p>
-    <w:p>
-      <w:r>
-        <w:t>Oggi l’installazione resta in simulazione, con automazione e trading reale disattivati. Uno stato positivo nella panoramica conferma la disponibilità dell’infrastruttura; non conferma la salute di un broker o la validità finanziaria di un messaggio.</w:t>
-      </w:r>
-    </w:p>
-    <w:p>
-      <w:r>
-        <w:t>Prima di utilizzare la raccolta reale, il team deve collegare l’account Telegram, verificare l’accesso alle fonti e controllare ricezione, modifiche, cancellazioni e recupero dopo un’interruzione. Per l’utilizzo con un broker serviranno inoltre il motore di rischio, la riconciliazione, i test sul conto demo e le verifiche del server di destinazione. L’abilitazione del trading reale non è disponibile come semplice interruttore della dashboard.</w:t>
-      </w:r>
-    </w:p>
-    <w:p>
-      <w:r>
-        <w:t>Prima dell’accesso remoto servono dominio, verifica MFA e prove dei ruoli; prima di OpenRouter servono credito, modello approvato, limiti di spesa e collaudo reale della fatturazione. Il superamento dei test locali non sostituisce queste configurazioni.</w:t>
-      </w:r>
-    </w:p>
-    <w:p>
-      <w:pPr>
-        <w:pStyle w:val="Heading1"/>
-      </w:pPr>
-      <w:r>
-        <w:t>Cronologia degli aggiornamenti</w:t>
-      </w:r>
-    </w:p>
-    <w:p>
-      <w:r>
-        <w:t>9 ottobre 2026 — Prima guida cliente mantenuta nel progetto. Descrive accesso, configurazioni confermate, gestione delle fonti dalla dashboard e raccolta Telegram della fase 4. Il collegamento a un account reale è ancora da predisporre.</w:t>
-      </w:r>
-    </w:p>
-    <w:p>
-      <w:r>
-        <w:t>11 ottobre 2026 — Aggiunta l’analisi consultiva della fase 5: esiti dei messaggi, proposte, attivazione confermata del simulatore, revisione delle modifiche e visibilità dei tentativi e delle prenotazioni. IA esterna e trading restano disabilitati.</w:t>
-      </w:r>
-    </w:p>
-    <w:p>
-      <w:r>
-        <w:t>12 ottobre 2026 — Predisposti Vercel, accesso remoto con MFA e ambienti separati; integrato OpenRouter con modelli collaudati, scadenza e costo massimo confermato. Distinti i test con dati di prova dal collaudo degli account reali ancora richiesto. La fase 6 e gli ordini restano da implementare.</w:t>
-      </w:r>
-    </w:p>
-    <w:p>
-      <w:r>
-        <w:t>12 ottobre 2026 — Aggiunto e verificato il cambio fra tema chiaro e scuro, disponibile anche all’accesso e su mobile, con preferenza conservata nel browser.</w:t>
+        <w:t>12 ottobre 2026 — Motore di rischio locale della fase 6 implementato e verificato. Chiariti i controlli e i lotti conservativi; conto, mercato autenticato, esecuzione e MT5 restano futuri. Aggiornati diagrammi e Word.</w:t>
       </w:r>
     </w:p>
     <w:sectPr>
@@ -1701,6 +1578,12 @@
   </w:num>
   <w:num w:numId="9">
     <w:abstractNumId w:val="0"/>
+  </w:num>
+  <w:num w:numId="10">
+    <w:abstractNumId w:val="7"/>
+    <w:lvlOverride w:ilvl="0">
+      <w:startOverride w:val="1"/>
+    </w:lvlOverride>
   </w:num>
 </w:numbering>
 </file>
@@ -13574,7 +13457,7 @@
       <w:spacing w:after="60"/>
     </w:pPr>
     <w:rPr>
-      <w:rFonts w:ascii="Consolas" w:hAnsi="Consolas"/>
+      <w:rFonts w:ascii="Liberation Mono" w:hAnsi="Liberation Mono"/>
       <w:sz w:val="17"/>
     </w:rPr>
   </w:style>

</xml_diff>

<commit_message>
docs: record phase 7 paper acceptance and verified Italian guides
</commit_message>
<xml_diff>
--- a/docs/cliente/GUIDA_CLIENTE.docx
+++ b/docs/cliente/GUIDA_CLIENTE.docx
@@ -15,7 +15,7 @@
         <w:pStyle w:val="Subtitle"/>
       </w:pPr>
       <w:r>
-        <w:t>Aggiornamento del 12 ottobre 2026 | Fase 6 | Analisi consultiva e rischio locale</w:t>
+        <w:t>Aggiornamento del 12 ottobre 2026 | Fase 7 | Analisi e ordini simulati in locale</w:t>
       </w:r>
     </w:p>
     <w:p>
@@ -48,7 +48,7 @@
       <w:r>
         <w:drawing>
           <wp:inline xmlns:a="http://schemas.openxmlformats.org/drawingml/2006/main" xmlns:pic="http://schemas.openxmlformats.org/drawingml/2006/picture">
-            <wp:extent cx="6048000" cy="3075030"/>
+            <wp:extent cx="6048000" cy="3074400"/>
             <wp:docPr id="1" name="Picture 1" descr="Flusso da Telegram alla dashboard con controlli e arresto prima degli ordini"/>
             <wp:cNvGraphicFramePr>
               <a:graphicFrameLocks noChangeAspect="1"/>
@@ -69,7 +69,7 @@
                   <pic:spPr>
                     <a:xfrm>
                       <a:off x="0" y="0"/>
-                      <a:ext cx="6048000" cy="3075030"/>
+                      <a:ext cx="6048000" cy="3074400"/>
                     </a:xfrm>
                     <a:prstGeom prst="rect"/>
                   </pic:spPr>
@@ -460,7 +460,7 @@
               <w:rPr>
                 <w:b w:val="0"/>
               </w:rPr>
-              <w:t>Motore del rischio</w:t>
+              <w:t>Rischio ed esecuzione simulata</w:t>
             </w:r>
           </w:p>
         </w:tc>
@@ -484,7 +484,7 @@
               <w:rPr>
                 <w:b w:val="0"/>
               </w:rPr>
-              <w:t>Implementato e verificato con dati di prova; non ancora collegato ai segnali e al conto</w:t>
+              <w:t>Collegati e verificati nel laboratorio locale: dati firmati, prenotazioni, ordini simulati e recupero</w:t>
             </w:r>
           </w:p>
         </w:tc>
@@ -512,7 +512,7 @@
               <w:rPr>
                 <w:b w:val="0"/>
               </w:rPr>
-              <w:t>Esecuzione, MT5 e ordini</w:t>
+              <w:t>MT5 e ordini reali</w:t>
             </w:r>
           </w:p>
         </w:tc>
@@ -1046,7 +1046,7 @@
               <w:rPr>
                 <w:b w:val="0"/>
               </w:rPr>
-              <w:t>Proposta consultiva; mancano conto e mercato verificati e collegamento all’esecuzione</w:t>
+              <w:t>Proposta consultiva; nell’avvio normale mancano conto e mercato verificati. Nessun ordine reale</w:t>
             </w:r>
           </w:p>
         </w:tc>
@@ -1271,10 +1271,10 @@
         <w:rPr>
           <w:b/>
         </w:rPr>
-        <w:t>I limiti restano preparatori:</w:t>
+        <w:t>Il laboratorio locale</w:t>
       </w:r>
       <w:r>
-        <w:t xml:space="preserve"> mancano dati autenticati di conto e mercato e collegamento all’esecuzione. Con esposizioni presenti, le modifiche del rischio richiedono il futuro servizio di esecuzione e vengono rifiutate.</w:t>
+        <w:t xml:space="preserve"> collega rischio e ordini simulati, con dati e chiavi temporanei; il team può provarlo senza tuoi account. Un esito incerto conserva il rischio e ferma nuove operazioni fino alla riconciliazione. Nel laboratorio, limiti più restrittivi fermano i comandi non inviati; esposizioni esterne restano soggette a verifica futura.</w:t>
       </w:r>
     </w:p>
     <w:p>
@@ -1293,7 +1293,7 @@
     </w:p>
     <w:p>
       <w:r>
-        <w:t>Prima della raccolta reale servono collegamento Telegram e prove di lettura, revisioni e recupero. Prima di IA a pagamento e accesso remoto servono account, budget, privacy, dominio e MFA collaudati. Prima di qualsiasi ordine serviranno collegamento del rischio, riconciliazione, MT5 e conto demo verificati; il trading reale richiede ulteriori autorizzazioni indipendenti.</w:t>
+        <w:t>Prima della raccolta reale servono collegamento Telegram e prove di lettura, revisioni e recupero. Prima di IA a pagamento e accesso remoto servono account, budget, privacy, dominio e MFA collaudati. Prima di qualsiasi ordine reale serviranno MT5, riconciliazione broker e conto demo verificati; il trading reale richiede ulteriori autorizzazioni indipendenti.</w:t>
       </w:r>
     </w:p>
     <w:p>
@@ -1332,6 +1332,11 @@
     <w:p>
       <w:r>
         <w:t>12 ottobre 2026 — Motore di rischio locale della fase 6 implementato e verificato. Chiariti i controlli e i lotti conservativi; conto, mercato autenticato, esecuzione e MT5 restano futuri. Aggiornati diagrammi e Word.</w:t>
+      </w:r>
+    </w:p>
+    <w:p>
+      <w:r>
+        <w:t>12 ottobre 2026 — Fase 7: rischio e ordini simulati collegati e verificati in laboratorio locale. API, credenziali esterne e test demo rinviati al collaudo finale; diagrammi e Word aggiornati.</w:t>
       </w:r>
     </w:p>
     <w:sectPr>

</xml_diff>

<commit_message>
docs: record local position acceptance and update verified Italian guides
</commit_message>
<xml_diff>
--- a/docs/cliente/GUIDA_CLIENTE.docx
+++ b/docs/cliente/GUIDA_CLIENTE.docx
@@ -460,7 +460,7 @@
               <w:rPr>
                 <w:b w:val="0"/>
               </w:rPr>
-              <w:t>Rischio ed esecuzione simulata</w:t>
+              <w:t>Rischio e posizioni simulate</w:t>
             </w:r>
           </w:p>
         </w:tc>
@@ -484,7 +484,7 @@
               <w:rPr>
                 <w:b w:val="0"/>
               </w:rPr>
-              <w:t>Collegati e verificati nel laboratorio locale: dati firmati, prenotazioni, ordini simulati e recupero</w:t>
+              <w:t>Aperture, stop, chiusure complete, risultati e recupero verificati nel laboratorio locale</w:t>
             </w:r>
           </w:p>
         </w:tc>
@@ -1265,16 +1265,39 @@
         <w:t>Controlli del rischio</w:t>
       </w:r>
       <w:r>
-        <w:t xml:space="preserve"> puoi preparare limiti più restrittivi: non puoi aumentare l’autorità del server, eliminare gli stop obbligatori o abilitare il trading reale. Il motore è implementato e verificato con dati di prova: controlla stop, rischio, perdita giornaliera, esposizione, lotti, leva, spread e orari. </w:t>
+        <w:t xml:space="preserve"> puoi ridurre i limiti, mantenendo stop obbligatori e trading reale disabilitato. Nel laboratorio, esiti incerti conservano l’esposizione e fermano nuove aperture.</w:t>
+      </w:r>
+    </w:p>
+    <w:p>
+      <w:r>
+        <w:t xml:space="preserve">In </w:t>
       </w:r>
       <w:r>
         <w:rPr>
           <w:b/>
         </w:rPr>
-        <w:t>Il laboratorio locale</w:t>
+        <w:t>Posizioni</w:t>
       </w:r>
       <w:r>
-        <w:t xml:space="preserve"> collega rischio e ordini simulati, con dati e chiavi temporanei; il team può provarlo senza tuoi account. Un esito incerto conserva il rischio e ferma nuove operazioni fino alla riconciliazione. Nel laboratorio, limiti più restrittivi fermano i comandi non inviati; esposizioni esterne restano soggette a verifica futura.</w:t>
+        <w:t xml:space="preserve">, ADMIN usa </w:t>
+      </w:r>
+      <w:r>
+        <w:rPr>
+          <w:b/>
+        </w:rPr>
+        <w:t>Gestisci simulazione</w:t>
+      </w:r>
+      <w:r>
+        <w:t xml:space="preserve"> per rivedere e confermare chiusura completa o stop che riduce il rischio. La richiesta non conferma l’esecuzione: aggiorna per vedere esito e risultato netto, con commissioni simulate. </w:t>
+      </w:r>
+      <w:r>
+        <w:rPr>
+          <w:b/>
+        </w:rPr>
+        <w:t>Verifica ripresa</w:t>
+      </w:r>
+      <w:r>
+        <w:t xml:space="preserve"> richiede dati riconciliati; non libera esiti incerti né azzera il blocco giornaliero. Un errore dei dati richiede conto senza posizioni. Tutto resta nel laboratorio locale.</w:t>
       </w:r>
     </w:p>
     <w:p>
@@ -1337,6 +1360,11 @@
     <w:p>
       <w:r>
         <w:t>12 ottobre 2026 — Fase 7: rischio e ordini simulati collegati e verificati in laboratorio locale. API, credenziali esterne e test demo rinviati al collaudo finale; diagrammi e Word aggiornati.</w:t>
+      </w:r>
+    </w:p>
+    <w:p>
+      <w:r>
+        <w:t>12 ottobre 2026 — Posizioni paper, risultati e ripresa controllata verificati.</w:t>
       </w:r>
     </w:p>
     <w:sectPr>

</xml_diff>

<commit_message>
docs: document MT5 simulation gates and verify updated Italian guides
</commit_message>
<xml_diff>
--- a/docs/cliente/GUIDA_CLIENTE.docx
+++ b/docs/cliente/GUIDA_CLIENTE.docx
@@ -20,16 +20,16 @@
     </w:p>
     <w:p>
       <w:r>
-        <w:t xml:space="preserve">TRD raccoglie messaggi da fonti Telegram autorizzate, riconosce segnali strutturati e mostra analisi e motivi di arresto nella dashboard. </w:t>
+        <w:t xml:space="preserve">TRD raccoglie fonti Telegram autorizzate e mostra segnali e analisi nella dashboard. </w:t>
       </w:r>
       <w:r>
         <w:rPr>
           <w:b/>
         </w:rPr>
-        <w:t>Oggi non invia ordini al broker.</w:t>
+        <w:t>Nessun ordine al broker:</w:t>
       </w:r>
       <w:r>
-        <w:t xml:space="preserve"> L’installazione resta locale, con simulatore gratuito, raccolta Telegram e agenti disattivati finché non vengono configurati.</w:t>
+        <w:t xml:space="preserve"> il laboratorio lavora in simulazione. L’installazione resta locale; raccolta e agenti sono disattivati fino alla configurazione.</w:t>
       </w:r>
     </w:p>
     <w:p>
@@ -512,7 +512,7 @@
               <w:rPr>
                 <w:b w:val="0"/>
               </w:rPr>
-              <w:t>MT5 e ordini reali</w:t>
+              <w:t>Bridge MT5 e broker</w:t>
             </w:r>
           </w:p>
         </w:tc>
@@ -535,7 +535,7 @@
               <w:rPr>
                 <w:b w:val="0"/>
               </w:rPr>
-              <w:t>Da implementare e collaudare; trading disabilitato</w:t>
+              <w:t>Sorgente e logica simulata verificati; compilazione nativa e adattatore broker ancora richiesti</w:t>
             </w:r>
           </w:p>
         </w:tc>
@@ -1316,7 +1316,19 @@
     </w:p>
     <w:p>
       <w:r>
-        <w:t>Prima della raccolta reale servono collegamento Telegram e prove di lettura, revisioni e recupero. Prima di IA a pagamento e accesso remoto servono account, budget, privacy, dominio e MFA collaudati. Prima di qualsiasi ordine reale serviranno MT5, riconciliazione broker e conto demo verificati; il trading reale richiede ulteriori autorizzazioni indipendenti.</w:t>
+        <w:t>Nei test finali il team collega Telegram, OpenRouter e accesso remoto, verificando lettura, budget, privacy e MFA. Per il broker servono adattatore MT5, riconciliazione e demo; live richiede autorizzazioni aggiuntive.</w:t>
+      </w:r>
+    </w:p>
+    <w:p>
+      <w:r/>
+      <w:r>
+        <w:rPr>
+          <w:b/>
+        </w:rPr>
+        <w:t>Bridge MT5</w:t>
+      </w:r>
+      <w:r>
+        <w:t xml:space="preserve"> spento all’avvio; logica simulata verificata, compilazione e terminale da collaudare.</w:t>
       </w:r>
     </w:p>
     <w:p>
@@ -1365,6 +1377,11 @@
     <w:p>
       <w:r>
         <w:t>12 ottobre 2026 — Posizioni paper, risultati e ripresa controllata verificati.</w:t>
+      </w:r>
+    </w:p>
+    <w:p>
+      <w:r>
+        <w:t>12 ottobre 2026 — Bridge MT5 locale: sorgente e simulazione verificati; terminale e broker da collaudare.</w:t>
       </w:r>
     </w:p>
     <w:sectPr>

</xml_diff>

<commit_message>
docs: document simulated MT5 order adapter and verify Italian guides
</commit_message>
<xml_diff>
--- a/docs/cliente/GUIDA_CLIENTE.docx
+++ b/docs/cliente/GUIDA_CLIENTE.docx
@@ -512,7 +512,7 @@
               <w:rPr>
                 <w:b w:val="0"/>
               </w:rPr>
-              <w:t>Bridge MT5 e broker</w:t>
+              <w:t>Bridge e adattatore MT5</w:t>
             </w:r>
           </w:p>
         </w:tc>
@@ -535,7 +535,7 @@
               <w:rPr>
                 <w:b w:val="0"/>
               </w:rPr>
-              <w:t>Sorgente e logica simulata verificati; compilazione nativa e adattatore broker ancora richiesti</w:t>
+              <w:t>Aperture, stop, chiusure ed esiti del broker verificati in simulazione; terminale e conto demo da collaudare</w:t>
             </w:r>
           </w:p>
         </w:tc>
@@ -1316,7 +1316,7 @@
     </w:p>
     <w:p>
       <w:r>
-        <w:t>Nei test finali il team collega Telegram, OpenRouter e accesso remoto, verificando lettura, budget, privacy e MFA. Per il broker servono adattatore MT5, riconciliazione e demo; live richiede autorizzazioni aggiuntive.</w:t>
+        <w:t>Nei test finali il team collega Telegram, OpenRouter e accesso remoto, verificando lettura, budget, privacy e MFA. L’adattatore MT5 prepara gli ordini in simulazione; collegamento al broker, riconciliazione reale e demo richiedono ancora collaudo. Live richiede autorizzazioni aggiuntive.</w:t>
       </w:r>
     </w:p>
     <w:p>
@@ -1328,7 +1328,7 @@
         <w:t>Bridge MT5</w:t>
       </w:r>
       <w:r>
-        <w:t xml:space="preserve"> spento all’avvio; logica simulata verificata, compilazione e terminale da collaudare.</w:t>
+        <w:t xml:space="preserve"> spento all’avvio. Timeout o risposta parziale fermano nuove aperture e conservano il rischio; ricevuta e accettazione non confermano l’esecuzione. Credenziali esterne riservate ai test finali.</w:t>
       </w:r>
     </w:p>
     <w:p>
@@ -1340,48 +1340,83 @@
       </w:r>
     </w:p>
     <w:p>
+      <w:pPr>
+        <w:pStyle w:val="GuideRevision"/>
+      </w:pPr>
       <w:r>
         <w:t>9 ottobre 2026 — Prima guida con accesso, fonti e raccolta Telegram; account reale da predisporre.</w:t>
       </w:r>
     </w:p>
     <w:p>
+      <w:pPr>
+        <w:pStyle w:val="GuideRevision"/>
+      </w:pPr>
       <w:r>
         <w:t>11 ottobre 2026 — Analisi consultiva, agenti locali, tentativi e prenotazioni dei costi; trading disabilitato.</w:t>
       </w:r>
     </w:p>
     <w:p>
+      <w:pPr>
+        <w:pStyle w:val="GuideRevision"/>
+      </w:pPr>
       <w:r>
         <w:t>12 ottobre 2026 — Preparazione Vercel, MFA e OpenRouter; account reali da collaudare, rischio e ordini futuri.</w:t>
       </w:r>
     </w:p>
     <w:p>
+      <w:pPr>
+        <w:pStyle w:val="GuideRevision"/>
+      </w:pPr>
       <w:r>
         <w:t>12 ottobre 2026 — Tema chiaro e scuro verificato anche all’accesso e su mobile.</w:t>
       </w:r>
     </w:p>
     <w:p>
+      <w:pPr>
+        <w:pStyle w:val="GuideRevision"/>
+      </w:pPr>
       <w:r>
         <w:t>12 ottobre 2026 — Guide snellite, diagrammi e rinvii operativi; distinti limiti attuali e funzioni future. Aggiornamenti documentali solo quando necessari.</w:t>
       </w:r>
     </w:p>
     <w:p>
+      <w:pPr>
+        <w:pStyle w:val="GuideRevision"/>
+      </w:pPr>
       <w:r>
         <w:t>12 ottobre 2026 — Motore di rischio locale della fase 6 implementato e verificato. Chiariti i controlli e i lotti conservativi; conto, mercato autenticato, esecuzione e MT5 restano futuri. Aggiornati diagrammi e Word.</w:t>
       </w:r>
     </w:p>
     <w:p>
+      <w:pPr>
+        <w:pStyle w:val="GuideRevision"/>
+      </w:pPr>
       <w:r>
         <w:t>12 ottobre 2026 — Fase 7: rischio e ordini simulati collegati e verificati in laboratorio locale. API, credenziali esterne e test demo rinviati al collaudo finale; diagrammi e Word aggiornati.</w:t>
       </w:r>
     </w:p>
     <w:p>
+      <w:pPr>
+        <w:pStyle w:val="GuideRevision"/>
+      </w:pPr>
       <w:r>
         <w:t>12 ottobre 2026 — Posizioni paper, risultati e ripresa controllata verificati.</w:t>
       </w:r>
     </w:p>
     <w:p>
+      <w:pPr>
+        <w:pStyle w:val="GuideRevision"/>
+      </w:pPr>
       <w:r>
         <w:t>12 ottobre 2026 — Bridge MT5 locale: sorgente e simulazione verificati; terminale e broker da collaudare.</w:t>
+      </w:r>
+    </w:p>
+    <w:p>
+      <w:pPr>
+        <w:pStyle w:val="GuideRevision"/>
+      </w:pPr>
+      <w:r>
+        <w:t>12 ottobre 2026 — Adattatore MT5 e recupero verificati in simulazione; broker e credenziali ai test finali.</w:t>
       </w:r>
     </w:p>
     <w:sectPr>
@@ -13510,6 +13545,13 @@
       <w:rFonts w:ascii="Liberation Mono" w:hAnsi="Liberation Mono"/>
       <w:sz w:val="17"/>
     </w:rPr>
+  </w:style>
+  <w:style w:type="paragraph" w:customStyle="1" w:styleId="GuideRevision">
+    <w:name w:val="Guide Revision"/>
+    <w:basedOn w:val="Normal"/>
+    <w:pPr>
+      <w:spacing w:line="240" w:lineRule="auto" w:after="40"/>
+    </w:pPr>
   </w:style>
 </w:styles>
 </file>

</xml_diff>

<commit_message>
docs: document native MT5 observation gates and verify Italian guides
</commit_message>
<xml_diff>
--- a/docs/cliente/GUIDA_CLIENTE.docx
+++ b/docs/cliente/GUIDA_CLIENTE.docx
@@ -512,7 +512,7 @@
               <w:rPr>
                 <w:b w:val="0"/>
               </w:rPr>
-              <w:t>Bridge e adattatore MT5</w:t>
+              <w:t>Bridge e MT5 nativo</w:t>
             </w:r>
           </w:p>
         </w:tc>
@@ -535,7 +535,7 @@
               <w:rPr>
                 <w:b w:val="0"/>
               </w:rPr>
-              <w:t>Aperture, stop, chiusure ed esiti del broker verificati in simulazione; terminale e conto demo da collaudare</w:t>
+              <w:t>Ordini simulati e lettura nativa in sorgente; invio escluso. Terminale e demo da collaudare</w:t>
             </w:r>
           </w:p>
         </w:tc>
@@ -1316,7 +1316,7 @@
     </w:p>
     <w:p>
       <w:r>
-        <w:t>Nei test finali il team collega Telegram, OpenRouter e accesso remoto, verificando lettura, budget, privacy e MFA. L’adattatore MT5 prepara gli ordini in simulazione; collegamento al broker, riconciliazione reale e demo richiedono ancora collaudo. Live richiede autorizzazioni aggiuntive.</w:t>
+        <w:t>Nei test finali il team collauda Telegram, OpenRouter e accesso remoto, verificando lettura, budget, privacy e MFA. Live richiede autorizzazioni aggiuntive.</w:t>
       </w:r>
     </w:p>
     <w:p>
@@ -1325,10 +1325,10 @@
         <w:rPr>
           <w:b/>
         </w:rPr>
-        <w:t>Bridge MT5</w:t>
+        <w:t>MT5 nativo</w:t>
       </w:r>
       <w:r>
-        <w:t xml:space="preserve"> spento all’avvio. Timeout o risposta parziale fermano nuove aperture e conservano il rischio; ricevuta e accettazione non confermano l’esecuzione. Credenziali esterne riservate ai test finali.</w:t>
+        <w:t xml:space="preserve"> spento all’avvio: osserva conto, mercato e storico in un registro locale privato. Non invia ordini né aggiorna il conto paper. Credenziali solo nel terminale ai test finali.</w:t>
       </w:r>
     </w:p>
     <w:p>
@@ -1417,6 +1417,14 @@
       </w:pPr>
       <w:r>
         <w:t>12 ottobre 2026 — Adattatore MT5 e recupero verificati in simulazione; broker e credenziali ai test finali.</w:t>
+      </w:r>
+    </w:p>
+    <w:p>
+      <w:pPr>
+        <w:pStyle w:val="GuideRevision"/>
+      </w:pPr>
+      <w:r>
+        <w:t>12 ottobre 2026 — Lettura nativa MT5 in sorgente verificata con dati simulati; invio broker escluso.</w:t>
       </w:r>
     </w:p>
     <w:sectPr>

</xml_diff>